<commit_message>
Doc. Sprint 2 - Fatta
Colleghi, voglio goduriosamente comunicarvi che la documentazione riguardante il secondo sprint è ora terminata.
</commit_message>
<xml_diff>
--- a/3_Documentazione/Documentazione-Sprint2.docx
+++ b/3_Documentazione/Documentazione-Sprint2.docx
@@ -593,10 +593,14 @@
         </w:p>
         <w:p>
           <w:pPr>
+            <w:pStyle w:val="Sommario1"/>
+            <w:tabs>
+              <w:tab w:val="right" w:leader="dot" w:pos="9628"/>
+            </w:tabs>
             <w:rPr>
-              <w:b/>
-              <w:bCs/>
-              <w:lang w:val="it-IT"/>
+              <w:rFonts w:eastAsiaTheme="minorEastAsia"/>
+              <w:noProof/>
+              <w:lang w:eastAsia="it-CH"/>
             </w:rPr>
           </w:pPr>
           <w:r>
@@ -608,15 +612,772 @@
           <w:r>
             <w:fldChar w:fldCharType="separate"/>
           </w:r>
-          <w:r>
+          <w:hyperlink w:anchor="_Toc193895988" w:history="1">
+            <w:r>
+              <w:rPr>
+                <w:rStyle w:val="Collegamentoipertestuale"/>
+                <w:noProof/>
+              </w:rPr>
+              <w:t>Implementazione</w:t>
+            </w:r>
+            <w:r>
+              <w:rPr>
+                <w:noProof/>
+                <w:webHidden/>
+              </w:rPr>
+              <w:tab/>
+            </w:r>
+            <w:r>
+              <w:rPr>
+                <w:noProof/>
+                <w:webHidden/>
+              </w:rPr>
+              <w:fldChar w:fldCharType="begin"/>
+            </w:r>
+            <w:r>
+              <w:rPr>
+                <w:noProof/>
+                <w:webHidden/>
+              </w:rPr>
+              <w:instrText xml:space="preserve"> PAGEREF _Toc193895988 \h </w:instrText>
+            </w:r>
+            <w:r>
+              <w:rPr>
+                <w:noProof/>
+                <w:webHidden/>
+              </w:rPr>
+            </w:r>
+            <w:r>
+              <w:rPr>
+                <w:noProof/>
+                <w:webHidden/>
+              </w:rPr>
+              <w:fldChar w:fldCharType="separate"/>
+            </w:r>
+            <w:r>
+              <w:rPr>
+                <w:noProof/>
+                <w:webHidden/>
+              </w:rPr>
+              <w:t>2</w:t>
+            </w:r>
+            <w:r>
+              <w:rPr>
+                <w:noProof/>
+                <w:webHidden/>
+              </w:rPr>
+              <w:fldChar w:fldCharType="end"/>
+            </w:r>
+          </w:hyperlink>
+        </w:p>
+        <w:p>
+          <w:pPr>
+            <w:pStyle w:val="Sommario2"/>
+            <w:tabs>
+              <w:tab w:val="right" w:leader="dot" w:pos="9628"/>
+            </w:tabs>
+            <w:rPr>
+              <w:rFonts w:eastAsiaTheme="minorEastAsia"/>
+              <w:noProof/>
+              <w:lang w:eastAsia="it-CH"/>
+            </w:rPr>
+          </w:pPr>
+          <w:hyperlink w:anchor="_Toc193895989" w:history="1">
+            <w:r>
+              <w:rPr>
+                <w:rStyle w:val="Collegamentoipertestuale"/>
+                <w:noProof/>
+              </w:rPr>
+              <w:t>Login e Sign Up</w:t>
+            </w:r>
+            <w:r>
+              <w:rPr>
+                <w:noProof/>
+                <w:webHidden/>
+              </w:rPr>
+              <w:tab/>
+            </w:r>
+            <w:r>
+              <w:rPr>
+                <w:noProof/>
+                <w:webHidden/>
+              </w:rPr>
+              <w:fldChar w:fldCharType="begin"/>
+            </w:r>
+            <w:r>
+              <w:rPr>
+                <w:noProof/>
+                <w:webHidden/>
+              </w:rPr>
+              <w:instrText xml:space="preserve"> PAGEREF _Toc193895989 \h </w:instrText>
+            </w:r>
+            <w:r>
+              <w:rPr>
+                <w:noProof/>
+                <w:webHidden/>
+              </w:rPr>
+            </w:r>
+            <w:r>
+              <w:rPr>
+                <w:noProof/>
+                <w:webHidden/>
+              </w:rPr>
+              <w:fldChar w:fldCharType="separate"/>
+            </w:r>
+            <w:r>
+              <w:rPr>
+                <w:noProof/>
+                <w:webHidden/>
+              </w:rPr>
+              <w:t>2</w:t>
+            </w:r>
+            <w:r>
+              <w:rPr>
+                <w:noProof/>
+                <w:webHidden/>
+              </w:rPr>
+              <w:fldChar w:fldCharType="end"/>
+            </w:r>
+          </w:hyperlink>
+        </w:p>
+        <w:p>
+          <w:pPr>
+            <w:pStyle w:val="Sommario2"/>
+            <w:tabs>
+              <w:tab w:val="right" w:leader="dot" w:pos="9628"/>
+            </w:tabs>
+            <w:rPr>
+              <w:rFonts w:eastAsiaTheme="minorEastAsia"/>
+              <w:noProof/>
+              <w:lang w:eastAsia="it-CH"/>
+            </w:rPr>
+          </w:pPr>
+          <w:hyperlink w:anchor="_Toc193895990" w:history="1">
+            <w:r>
+              <w:rPr>
+                <w:rStyle w:val="Collegamentoipertestuale"/>
+                <w:noProof/>
+              </w:rPr>
+              <w:t>Visualizzazione pagina di gestione prodotti</w:t>
+            </w:r>
+            <w:r>
+              <w:rPr>
+                <w:noProof/>
+                <w:webHidden/>
+              </w:rPr>
+              <w:tab/>
+            </w:r>
+            <w:r>
+              <w:rPr>
+                <w:noProof/>
+                <w:webHidden/>
+              </w:rPr>
+              <w:fldChar w:fldCharType="begin"/>
+            </w:r>
+            <w:r>
+              <w:rPr>
+                <w:noProof/>
+                <w:webHidden/>
+              </w:rPr>
+              <w:instrText xml:space="preserve"> PAGEREF _Toc193895990 \h </w:instrText>
+            </w:r>
+            <w:r>
+              <w:rPr>
+                <w:noProof/>
+                <w:webHidden/>
+              </w:rPr>
+            </w:r>
+            <w:r>
+              <w:rPr>
+                <w:noProof/>
+                <w:webHidden/>
+              </w:rPr>
+              <w:fldChar w:fldCharType="separate"/>
+            </w:r>
+            <w:r>
+              <w:rPr>
+                <w:noProof/>
+                <w:webHidden/>
+              </w:rPr>
+              <w:t>4</w:t>
+            </w:r>
+            <w:r>
+              <w:rPr>
+                <w:noProof/>
+                <w:webHidden/>
+              </w:rPr>
+              <w:fldChar w:fldCharType="end"/>
+            </w:r>
+          </w:hyperlink>
+        </w:p>
+        <w:p>
+          <w:pPr>
+            <w:pStyle w:val="Sommario2"/>
+            <w:tabs>
+              <w:tab w:val="right" w:leader="dot" w:pos="9628"/>
+            </w:tabs>
+            <w:rPr>
+              <w:rFonts w:eastAsiaTheme="minorEastAsia"/>
+              <w:noProof/>
+              <w:lang w:eastAsia="it-CH"/>
+            </w:rPr>
+          </w:pPr>
+          <w:hyperlink w:anchor="_Toc193895991" w:history="1">
+            <w:r>
+              <w:rPr>
+                <w:rStyle w:val="Collegamentoipertestuale"/>
+                <w:noProof/>
+              </w:rPr>
+              <w:t>Visualizzazione pagina di gestione account</w:t>
+            </w:r>
+            <w:r>
+              <w:rPr>
+                <w:noProof/>
+                <w:webHidden/>
+              </w:rPr>
+              <w:tab/>
+            </w:r>
+            <w:r>
+              <w:rPr>
+                <w:noProof/>
+                <w:webHidden/>
+              </w:rPr>
+              <w:fldChar w:fldCharType="begin"/>
+            </w:r>
+            <w:r>
+              <w:rPr>
+                <w:noProof/>
+                <w:webHidden/>
+              </w:rPr>
+              <w:instrText xml:space="preserve"> PAGEREF _Toc193895991 \h </w:instrText>
+            </w:r>
+            <w:r>
+              <w:rPr>
+                <w:noProof/>
+                <w:webHidden/>
+              </w:rPr>
+            </w:r>
+            <w:r>
+              <w:rPr>
+                <w:noProof/>
+                <w:webHidden/>
+              </w:rPr>
+              <w:fldChar w:fldCharType="separate"/>
+            </w:r>
+            <w:r>
+              <w:rPr>
+                <w:noProof/>
+                <w:webHidden/>
+              </w:rPr>
+              <w:t>4</w:t>
+            </w:r>
+            <w:r>
+              <w:rPr>
+                <w:noProof/>
+                <w:webHidden/>
+              </w:rPr>
+              <w:fldChar w:fldCharType="end"/>
+            </w:r>
+          </w:hyperlink>
+        </w:p>
+        <w:p>
+          <w:pPr>
+            <w:pStyle w:val="Sommario2"/>
+            <w:tabs>
+              <w:tab w:val="right" w:leader="dot" w:pos="9628"/>
+            </w:tabs>
+            <w:rPr>
+              <w:rFonts w:eastAsiaTheme="minorEastAsia"/>
+              <w:noProof/>
+              <w:lang w:eastAsia="it-CH"/>
+            </w:rPr>
+          </w:pPr>
+          <w:hyperlink w:anchor="_Toc193895992" w:history="1">
+            <w:r>
+              <w:rPr>
+                <w:rStyle w:val="Collegamentoipertestuale"/>
+                <w:noProof/>
+              </w:rPr>
+              <w:t>Visualizzazione pagina di gestione utenti</w:t>
+            </w:r>
+            <w:r>
+              <w:rPr>
+                <w:noProof/>
+                <w:webHidden/>
+              </w:rPr>
+              <w:tab/>
+            </w:r>
+            <w:r>
+              <w:rPr>
+                <w:noProof/>
+                <w:webHidden/>
+              </w:rPr>
+              <w:fldChar w:fldCharType="begin"/>
+            </w:r>
+            <w:r>
+              <w:rPr>
+                <w:noProof/>
+                <w:webHidden/>
+              </w:rPr>
+              <w:instrText xml:space="preserve"> PAGEREF _Toc193895992 \h </w:instrText>
+            </w:r>
+            <w:r>
+              <w:rPr>
+                <w:noProof/>
+                <w:webHidden/>
+              </w:rPr>
+            </w:r>
+            <w:r>
+              <w:rPr>
+                <w:noProof/>
+                <w:webHidden/>
+              </w:rPr>
+              <w:fldChar w:fldCharType="separate"/>
+            </w:r>
+            <w:r>
+              <w:rPr>
+                <w:noProof/>
+                <w:webHidden/>
+              </w:rPr>
+              <w:t>5</w:t>
+            </w:r>
+            <w:r>
+              <w:rPr>
+                <w:noProof/>
+                <w:webHidden/>
+              </w:rPr>
+              <w:fldChar w:fldCharType="end"/>
+            </w:r>
+          </w:hyperlink>
+        </w:p>
+        <w:p>
+          <w:pPr>
+            <w:pStyle w:val="Sommario1"/>
+            <w:tabs>
+              <w:tab w:val="right" w:leader="dot" w:pos="9628"/>
+            </w:tabs>
+            <w:rPr>
+              <w:rFonts w:eastAsiaTheme="minorEastAsia"/>
+              <w:noProof/>
+              <w:lang w:eastAsia="it-CH"/>
+            </w:rPr>
+          </w:pPr>
+          <w:hyperlink w:anchor="_Toc193895993" w:history="1">
+            <w:r>
+              <w:rPr>
+                <w:rStyle w:val="Collegamentoipertestuale"/>
+                <w:noProof/>
+              </w:rPr>
+              <w:t>Popolamento dati</w:t>
+            </w:r>
+            <w:r>
+              <w:rPr>
+                <w:noProof/>
+                <w:webHidden/>
+              </w:rPr>
+              <w:tab/>
+            </w:r>
+            <w:r>
+              <w:rPr>
+                <w:noProof/>
+                <w:webHidden/>
+              </w:rPr>
+              <w:fldChar w:fldCharType="begin"/>
+            </w:r>
+            <w:r>
+              <w:rPr>
+                <w:noProof/>
+                <w:webHidden/>
+              </w:rPr>
+              <w:instrText xml:space="preserve"> PAGEREF _Toc193895993 \h </w:instrText>
+            </w:r>
+            <w:r>
+              <w:rPr>
+                <w:noProof/>
+                <w:webHidden/>
+              </w:rPr>
+            </w:r>
+            <w:r>
+              <w:rPr>
+                <w:noProof/>
+                <w:webHidden/>
+              </w:rPr>
+              <w:fldChar w:fldCharType="separate"/>
+            </w:r>
+            <w:r>
+              <w:rPr>
+                <w:noProof/>
+                <w:webHidden/>
+              </w:rPr>
+              <w:t>6</w:t>
+            </w:r>
+            <w:r>
+              <w:rPr>
+                <w:noProof/>
+                <w:webHidden/>
+              </w:rPr>
+              <w:fldChar w:fldCharType="end"/>
+            </w:r>
+          </w:hyperlink>
+        </w:p>
+        <w:p>
+          <w:pPr>
+            <w:pStyle w:val="Sommario2"/>
+            <w:tabs>
+              <w:tab w:val="right" w:leader="dot" w:pos="9628"/>
+            </w:tabs>
+            <w:rPr>
+              <w:rFonts w:eastAsiaTheme="minorEastAsia"/>
+              <w:noProof/>
+              <w:lang w:eastAsia="it-CH"/>
+            </w:rPr>
+          </w:pPr>
+          <w:hyperlink w:anchor="_Toc193895994" w:history="1">
+            <w:r>
+              <w:rPr>
+                <w:rStyle w:val="Collegamentoipertestuale"/>
+                <w:noProof/>
+              </w:rPr>
+              <w:t>Migrations</w:t>
+            </w:r>
+            <w:r>
+              <w:rPr>
+                <w:noProof/>
+                <w:webHidden/>
+              </w:rPr>
+              <w:tab/>
+            </w:r>
+            <w:r>
+              <w:rPr>
+                <w:noProof/>
+                <w:webHidden/>
+              </w:rPr>
+              <w:fldChar w:fldCharType="begin"/>
+            </w:r>
+            <w:r>
+              <w:rPr>
+                <w:noProof/>
+                <w:webHidden/>
+              </w:rPr>
+              <w:instrText xml:space="preserve"> PAGEREF _Toc193895994 \h </w:instrText>
+            </w:r>
+            <w:r>
+              <w:rPr>
+                <w:noProof/>
+                <w:webHidden/>
+              </w:rPr>
+            </w:r>
+            <w:r>
+              <w:rPr>
+                <w:noProof/>
+                <w:webHidden/>
+              </w:rPr>
+              <w:fldChar w:fldCharType="separate"/>
+            </w:r>
+            <w:r>
+              <w:rPr>
+                <w:noProof/>
+                <w:webHidden/>
+              </w:rPr>
+              <w:t>6</w:t>
+            </w:r>
+            <w:r>
+              <w:rPr>
+                <w:noProof/>
+                <w:webHidden/>
+              </w:rPr>
+              <w:fldChar w:fldCharType="end"/>
+            </w:r>
+          </w:hyperlink>
+        </w:p>
+        <w:p>
+          <w:pPr>
+            <w:pStyle w:val="Sommario2"/>
+            <w:tabs>
+              <w:tab w:val="right" w:leader="dot" w:pos="9628"/>
+            </w:tabs>
+            <w:rPr>
+              <w:rFonts w:eastAsiaTheme="minorEastAsia"/>
+              <w:noProof/>
+              <w:lang w:eastAsia="it-CH"/>
+            </w:rPr>
+          </w:pPr>
+          <w:hyperlink w:anchor="_Toc193895995" w:history="1">
+            <w:r>
+              <w:rPr>
+                <w:rStyle w:val="Collegamentoipertestuale"/>
+                <w:noProof/>
+              </w:rPr>
+              <w:t>Factories</w:t>
+            </w:r>
+            <w:r>
+              <w:rPr>
+                <w:noProof/>
+                <w:webHidden/>
+              </w:rPr>
+              <w:tab/>
+            </w:r>
+            <w:r>
+              <w:rPr>
+                <w:noProof/>
+                <w:webHidden/>
+              </w:rPr>
+              <w:fldChar w:fldCharType="begin"/>
+            </w:r>
+            <w:r>
+              <w:rPr>
+                <w:noProof/>
+                <w:webHidden/>
+              </w:rPr>
+              <w:instrText xml:space="preserve"> PAGEREF _Toc193895995 \h </w:instrText>
+            </w:r>
+            <w:r>
+              <w:rPr>
+                <w:noProof/>
+                <w:webHidden/>
+              </w:rPr>
+            </w:r>
+            <w:r>
+              <w:rPr>
+                <w:noProof/>
+                <w:webHidden/>
+              </w:rPr>
+              <w:fldChar w:fldCharType="separate"/>
+            </w:r>
+            <w:r>
+              <w:rPr>
+                <w:noProof/>
+                <w:webHidden/>
+              </w:rPr>
+              <w:t>7</w:t>
+            </w:r>
+            <w:r>
+              <w:rPr>
+                <w:noProof/>
+                <w:webHidden/>
+              </w:rPr>
+              <w:fldChar w:fldCharType="end"/>
+            </w:r>
+          </w:hyperlink>
+        </w:p>
+        <w:p>
+          <w:pPr>
+            <w:pStyle w:val="Sommario2"/>
+            <w:tabs>
+              <w:tab w:val="right" w:leader="dot" w:pos="9628"/>
+            </w:tabs>
+            <w:rPr>
+              <w:rFonts w:eastAsiaTheme="minorEastAsia"/>
+              <w:noProof/>
+              <w:lang w:eastAsia="it-CH"/>
+            </w:rPr>
+          </w:pPr>
+          <w:hyperlink w:anchor="_Toc193895996" w:history="1">
+            <w:r>
+              <w:rPr>
+                <w:rStyle w:val="Collegamentoipertestuale"/>
+                <w:noProof/>
+              </w:rPr>
+              <w:t>Seeders</w:t>
+            </w:r>
+            <w:r>
+              <w:rPr>
+                <w:noProof/>
+                <w:webHidden/>
+              </w:rPr>
+              <w:tab/>
+            </w:r>
+            <w:r>
+              <w:rPr>
+                <w:noProof/>
+                <w:webHidden/>
+              </w:rPr>
+              <w:fldChar w:fldCharType="begin"/>
+            </w:r>
+            <w:r>
+              <w:rPr>
+                <w:noProof/>
+                <w:webHidden/>
+              </w:rPr>
+              <w:instrText xml:space="preserve"> PAGEREF _Toc193895996 \h </w:instrText>
+            </w:r>
+            <w:r>
+              <w:rPr>
+                <w:noProof/>
+                <w:webHidden/>
+              </w:rPr>
+            </w:r>
+            <w:r>
+              <w:rPr>
+                <w:noProof/>
+                <w:webHidden/>
+              </w:rPr>
+              <w:fldChar w:fldCharType="separate"/>
+            </w:r>
+            <w:r>
+              <w:rPr>
+                <w:noProof/>
+                <w:webHidden/>
+              </w:rPr>
+              <w:t>7</w:t>
+            </w:r>
+            <w:r>
+              <w:rPr>
+                <w:noProof/>
+                <w:webHidden/>
+              </w:rPr>
+              <w:fldChar w:fldCharType="end"/>
+            </w:r>
+          </w:hyperlink>
+        </w:p>
+        <w:p>
+          <w:pPr>
+            <w:pStyle w:val="Sommario3"/>
+            <w:tabs>
+              <w:tab w:val="right" w:leader="dot" w:pos="9628"/>
+            </w:tabs>
+            <w:rPr>
+              <w:rFonts w:eastAsiaTheme="minorEastAsia"/>
+              <w:noProof/>
+              <w:lang w:eastAsia="it-CH"/>
+            </w:rPr>
+          </w:pPr>
+          <w:hyperlink w:anchor="_Toc193895997" w:history="1">
+            <w:r>
+              <w:rPr>
+                <w:rStyle w:val="Collegamentoipertestuale"/>
+                <w:noProof/>
+              </w:rPr>
+              <w:t>Riassunto delle differenze</w:t>
+            </w:r>
+            <w:r>
+              <w:rPr>
+                <w:noProof/>
+                <w:webHidden/>
+              </w:rPr>
+              <w:tab/>
+            </w:r>
+            <w:r>
+              <w:rPr>
+                <w:noProof/>
+                <w:webHidden/>
+              </w:rPr>
+              <w:fldChar w:fldCharType="begin"/>
+            </w:r>
+            <w:r>
+              <w:rPr>
+                <w:noProof/>
+                <w:webHidden/>
+              </w:rPr>
+              <w:instrText xml:space="preserve"> PAGEREF _Toc193895997 \h </w:instrText>
+            </w:r>
+            <w:r>
+              <w:rPr>
+                <w:noProof/>
+                <w:webHidden/>
+              </w:rPr>
+            </w:r>
+            <w:r>
+              <w:rPr>
+                <w:noProof/>
+                <w:webHidden/>
+              </w:rPr>
+              <w:fldChar w:fldCharType="separate"/>
+            </w:r>
+            <w:r>
+              <w:rPr>
+                <w:noProof/>
+                <w:webHidden/>
+              </w:rPr>
+              <w:t>8</w:t>
+            </w:r>
+            <w:r>
+              <w:rPr>
+                <w:noProof/>
+                <w:webHidden/>
+              </w:rPr>
+              <w:fldChar w:fldCharType="end"/>
+            </w:r>
+          </w:hyperlink>
+        </w:p>
+        <w:p>
+          <w:pPr>
+            <w:pStyle w:val="Sommario1"/>
+            <w:tabs>
+              <w:tab w:val="right" w:leader="dot" w:pos="9628"/>
+            </w:tabs>
+            <w:rPr>
+              <w:rFonts w:eastAsiaTheme="minorEastAsia"/>
+              <w:noProof/>
+              <w:lang w:eastAsia="it-CH"/>
+            </w:rPr>
+          </w:pPr>
+          <w:hyperlink w:anchor="_Toc193895998" w:history="1">
+            <w:r>
+              <w:rPr>
+                <w:rStyle w:val="Collegamentoipertestuale"/>
+                <w:noProof/>
+              </w:rPr>
+              <w:t>Struttura del progetto</w:t>
+            </w:r>
+            <w:r>
+              <w:rPr>
+                <w:noProof/>
+                <w:webHidden/>
+              </w:rPr>
+              <w:tab/>
+            </w:r>
+            <w:r>
+              <w:rPr>
+                <w:noProof/>
+                <w:webHidden/>
+              </w:rPr>
+              <w:fldChar w:fldCharType="begin"/>
+            </w:r>
+            <w:r>
+              <w:rPr>
+                <w:noProof/>
+                <w:webHidden/>
+              </w:rPr>
+              <w:instrText xml:space="preserve"> PAGEREF _Toc193895998 \h </w:instrText>
+            </w:r>
+            <w:r>
+              <w:rPr>
+                <w:noProof/>
+                <w:webHidden/>
+              </w:rPr>
+            </w:r>
+            <w:r>
+              <w:rPr>
+                <w:noProof/>
+                <w:webHidden/>
+              </w:rPr>
+              <w:fldChar w:fldCharType="separate"/>
+            </w:r>
+            <w:r>
+              <w:rPr>
+                <w:noProof/>
+                <w:webHidden/>
+              </w:rPr>
+              <w:t>8</w:t>
+            </w:r>
+            <w:r>
+              <w:rPr>
+                <w:noProof/>
+                <w:webHidden/>
+              </w:rPr>
+              <w:fldChar w:fldCharType="end"/>
+            </w:r>
+          </w:hyperlink>
+        </w:p>
+        <w:p>
+          <w:pPr>
             <w:rPr>
               <w:b/>
               <w:bCs/>
-              <w:noProof/>
               <w:lang w:val="it-IT"/>
             </w:rPr>
-            <w:t>Nessuna voce di sommario trovata.</w:t>
-          </w:r>
+          </w:pPr>
           <w:r>
             <w:rPr>
               <w:b/>
@@ -649,6 +1410,7 @@
           <w:u w:val="single"/>
         </w:rPr>
       </w:pPr>
+      <w:bookmarkStart w:id="1" w:name="_Toc193895988"/>
       <w:r>
         <w:rPr>
           <w:u w:val="single"/>
@@ -656,6 +1418,7 @@
         <w:lastRenderedPageBreak/>
         <w:t>Implementazione</w:t>
       </w:r>
+      <w:bookmarkEnd w:id="1"/>
     </w:p>
     <w:p>
       <w:pPr>
@@ -664,12 +1427,14 @@
           <w:u w:val="single"/>
         </w:rPr>
       </w:pPr>
+      <w:bookmarkStart w:id="2" w:name="_Toc193895989"/>
       <w:r>
         <w:rPr>
           <w:u w:val="single"/>
         </w:rPr>
         <w:t>Login e Sign Up</w:t>
       </w:r>
+      <w:bookmarkEnd w:id="2"/>
     </w:p>
     <w:p>
       <w:pPr>
@@ -681,19 +1446,7 @@
         <w:rPr>
           <w:lang w:val="it-IT"/>
         </w:rPr>
-        <w:t>Per implementare le funzioni di login e signup all’interno del nostro progetto abbiamo utilizzato un pacchetto ufficiale di Laravel, Breeze. Esso fornisce un sistema di autenticazione semplice e</w:t>
-      </w:r>
-      <w:r>
-        <w:rPr>
-          <w:lang w:val="it-IT"/>
-        </w:rPr>
-        <w:t xml:space="preserve"> </w:t>
-      </w:r>
-      <w:r>
-        <w:rPr>
-          <w:lang w:val="it-IT"/>
-        </w:rPr>
-        <w:t>personalizzabile.</w:t>
+        <w:t>Per implementare le funzioni di login e signup all’interno del nostro progetto abbiamo utilizzato un pacchetto ufficiale di Laravel, Breeze. Esso fornisce un sistema di autenticazione semplice e personalizzabile.</w:t>
       </w:r>
     </w:p>
     <w:p>
@@ -894,14 +1647,27 @@
         <w:pStyle w:val="Didascalia"/>
         <w:jc w:val="center"/>
       </w:pPr>
-      <w:fldSimple w:instr=" SEQ Figura \* ARABIC ">
-        <w:r>
-          <w:rPr>
-            <w:noProof/>
-          </w:rPr>
-          <w:t>2</w:t>
-        </w:r>
-      </w:fldSimple>
+      <w:r>
+        <w:fldChar w:fldCharType="begin"/>
+      </w:r>
+      <w:r>
+        <w:instrText xml:space="preserve"> SEQ Figura \* ARABIC </w:instrText>
+      </w:r>
+      <w:r>
+        <w:fldChar w:fldCharType="separate"/>
+      </w:r>
+      <w:r>
+        <w:rPr>
+          <w:noProof/>
+        </w:rPr>
+        <w:t>2</w:t>
+      </w:r>
+      <w:r>
+        <w:rPr>
+          <w:noProof/>
+        </w:rPr>
+        <w:fldChar w:fldCharType="end"/>
+      </w:r>
       <w:r>
         <w:t xml:space="preserve"> - Pagina di Sign Up</w:t>
       </w:r>
@@ -922,11 +1688,12 @@
     </w:p>
     <w:p>
       <w:pPr>
-        <w:pStyle w:val="Titolo1"/>
+        <w:pStyle w:val="Titolo2"/>
         <w:rPr>
           <w:u w:val="single"/>
         </w:rPr>
       </w:pPr>
+      <w:bookmarkStart w:id="3" w:name="_Toc193895990"/>
       <w:r>
         <w:rPr>
           <w:u w:val="single"/>
@@ -934,6 +1701,7 @@
         <w:lastRenderedPageBreak/>
         <w:t>Visualizzazione pagina di gestione prodotti</w:t>
       </w:r>
+      <w:bookmarkEnd w:id="3"/>
     </w:p>
     <w:p>
       <w:r>
@@ -997,25 +1765,19 @@
     </w:p>
     <w:p>
       <w:pPr>
-        <w:pStyle w:val="Titolo1"/>
+        <w:pStyle w:val="Titolo2"/>
         <w:rPr>
           <w:u w:val="single"/>
         </w:rPr>
       </w:pPr>
-      <w:bookmarkStart w:id="1" w:name="_GoBack"/>
-      <w:bookmarkEnd w:id="1"/>
+      <w:bookmarkStart w:id="4" w:name="_Toc193895991"/>
       <w:r>
         <w:rPr>
           <w:u w:val="single"/>
         </w:rPr>
-        <w:t xml:space="preserve">Visualizzazione pagina di gestione </w:t>
-      </w:r>
-      <w:r>
-        <w:rPr>
-          <w:u w:val="single"/>
-        </w:rPr>
-        <w:t>account</w:t>
-      </w:r>
+        <w:t>Visualizzazione pagina di gestione account</w:t>
+      </w:r>
+      <w:bookmarkEnd w:id="4"/>
     </w:p>
     <w:p>
       <w:r>
@@ -1092,14 +1854,27 @@
         <w:pStyle w:val="Didascalia"/>
         <w:jc w:val="center"/>
       </w:pPr>
-      <w:fldSimple w:instr=" SEQ Figura \* ARABIC ">
-        <w:r>
-          <w:rPr>
-            <w:noProof/>
-          </w:rPr>
-          <w:t>3</w:t>
-        </w:r>
-      </w:fldSimple>
+      <w:r>
+        <w:fldChar w:fldCharType="begin"/>
+      </w:r>
+      <w:r>
+        <w:instrText xml:space="preserve"> SEQ Figura \* ARABIC </w:instrText>
+      </w:r>
+      <w:r>
+        <w:fldChar w:fldCharType="separate"/>
+      </w:r>
+      <w:r>
+        <w:rPr>
+          <w:noProof/>
+        </w:rPr>
+        <w:t>3</w:t>
+      </w:r>
+      <w:r>
+        <w:rPr>
+          <w:noProof/>
+        </w:rPr>
+        <w:fldChar w:fldCharType="end"/>
+      </w:r>
       <w:r>
         <w:t xml:space="preserve"> - Pagina di gestione account - sezione informazioni profilo</w:t>
       </w:r>
@@ -1168,21 +1943,2488 @@
         <w:pStyle w:val="Didascalia"/>
         <w:jc w:val="center"/>
       </w:pPr>
+      <w:r>
+        <w:fldChar w:fldCharType="begin"/>
+      </w:r>
+      <w:r>
+        <w:instrText xml:space="preserve"> SEQ Figura \* ARABIC </w:instrText>
+      </w:r>
+      <w:r>
+        <w:fldChar w:fldCharType="separate"/>
+      </w:r>
+      <w:r>
+        <w:rPr>
+          <w:noProof/>
+        </w:rPr>
+        <w:t>4</w:t>
+      </w:r>
+      <w:r>
+        <w:rPr>
+          <w:noProof/>
+        </w:rPr>
+        <w:fldChar w:fldCharType="end"/>
+      </w:r>
+      <w:r>
+        <w:t xml:space="preserve"> - Pagina di gestione account - sezione di modifica password</w:t>
+      </w:r>
+    </w:p>
+    <w:p>
+      <w:pPr>
+        <w:jc w:val="center"/>
+        <w:rPr>
+          <w:noProof/>
+        </w:rPr>
+      </w:pPr>
+    </w:p>
+    <w:p>
+      <w:pPr>
+        <w:keepNext/>
+        <w:jc w:val="center"/>
+      </w:pPr>
+      <w:r>
+        <w:rPr>
+          <w:noProof/>
+        </w:rPr>
+        <w:drawing>
+          <wp:inline distT="0" distB="0" distL="0" distR="0" wp14:anchorId="704FAA4D" wp14:editId="71A65178">
+            <wp:extent cx="4228368" cy="1256306"/>
+            <wp:effectExtent l="95250" t="76200" r="96520" b="77470"/>
+            <wp:docPr id="3" name="Immagine 3"/>
+            <wp:cNvGraphicFramePr>
+              <a:graphicFrameLocks xmlns:a="http://schemas.openxmlformats.org/drawingml/2006/main" noChangeAspect="1"/>
+            </wp:cNvGraphicFramePr>
+            <a:graphic xmlns:a="http://schemas.openxmlformats.org/drawingml/2006/main">
+              <a:graphicData uri="http://schemas.openxmlformats.org/drawingml/2006/picture">
+                <pic:pic xmlns:pic="http://schemas.openxmlformats.org/drawingml/2006/picture">
+                  <pic:nvPicPr>
+                    <pic:cNvPr id="1" name=""/>
+                    <pic:cNvPicPr/>
+                  </pic:nvPicPr>
+                  <pic:blipFill>
+                    <a:blip r:embed="rId14"/>
+                    <a:stretch>
+                      <a:fillRect/>
+                    </a:stretch>
+                  </pic:blipFill>
+                  <pic:spPr>
+                    <a:xfrm>
+                      <a:off x="0" y="0"/>
+                      <a:ext cx="4305854" cy="1279328"/>
+                    </a:xfrm>
+                    <a:prstGeom prst="rect">
+                      <a:avLst/>
+                    </a:prstGeom>
+                    <a:effectLst>
+                      <a:outerShdw blurRad="63500" sx="102000" sy="102000" algn="ctr" rotWithShape="0">
+                        <a:prstClr val="black">
+                          <a:alpha val="40000"/>
+                        </a:prstClr>
+                      </a:outerShdw>
+                    </a:effectLst>
+                  </pic:spPr>
+                </pic:pic>
+              </a:graphicData>
+            </a:graphic>
+          </wp:inline>
+        </w:drawing>
+      </w:r>
+    </w:p>
+    <w:p>
+      <w:pPr>
+        <w:pStyle w:val="Didascalia"/>
+        <w:jc w:val="center"/>
+      </w:pPr>
       <w:fldSimple w:instr=" SEQ Figura \* ARABIC ">
         <w:r>
           <w:rPr>
             <w:noProof/>
           </w:rPr>
-          <w:t>4</w:t>
+          <w:t>5</w:t>
         </w:r>
       </w:fldSimple>
       <w:r>
-        <w:t xml:space="preserve"> - Pagina di gestione account - sezione di modifica password</w:t>
-      </w:r>
+        <w:t xml:space="preserve"> - Pagina di gestione account - sezione di eliminazione account</w:t>
+      </w:r>
+    </w:p>
+    <w:p/>
+    <w:p>
+      <w:pPr>
+        <w:pStyle w:val="Titolo2"/>
+        <w:rPr>
+          <w:u w:val="single"/>
+        </w:rPr>
+      </w:pPr>
+      <w:bookmarkStart w:id="5" w:name="_Toc193895992"/>
+      <w:r>
+        <w:rPr>
+          <w:u w:val="single"/>
+        </w:rPr>
+        <w:t>Visualizzazione pagina di gestione utenti</w:t>
+      </w:r>
+      <w:bookmarkEnd w:id="5"/>
+    </w:p>
+    <w:p>
+      <w:r>
+        <w:t xml:space="preserve">Questa pagina è dedicata </w:t>
+      </w:r>
+      <w:r>
+        <w:t>all’admin</w:t>
+      </w:r>
+      <w:r>
+        <w:t xml:space="preserve">, ed al suo interno egli può gestire le informazioni riguardanti </w:t>
+      </w:r>
+      <w:r>
+        <w:t xml:space="preserve">gli </w:t>
+      </w:r>
+      <w:r>
+        <w:t>account</w:t>
+      </w:r>
+      <w:r>
+        <w:t xml:space="preserve"> degli utenti, come l’id, il nome, cognome, data di nascita, indirizzo, NAP, città, paese, numero di telefono e mail. Egli ha anche la facoltà di eliminare gli account. </w:t>
+      </w:r>
+      <w:r>
+        <w:t>Questa pagina è generata automaticamente da</w:t>
+      </w:r>
+      <w:r>
+        <w:t xml:space="preserve"> </w:t>
+      </w:r>
+      <w:proofErr w:type="spellStart"/>
+      <w:r>
+        <w:t>Breeze</w:t>
+      </w:r>
+      <w:proofErr w:type="spellEnd"/>
+      <w:r>
+        <w:t>, ma è anche possibile apportare molteplici modifiche.</w:t>
+      </w:r>
+    </w:p>
+    <w:p>
+      <w:pPr>
+        <w:jc w:val="center"/>
+      </w:pPr>
+      <w:r>
+        <w:rPr>
+          <w:noProof/>
+        </w:rPr>
+        <w:drawing>
+          <wp:inline distT="0" distB="0" distL="0" distR="0" wp14:anchorId="758EC4BA" wp14:editId="7E154704">
+            <wp:extent cx="6333097" cy="1184745"/>
+            <wp:effectExtent l="114300" t="76200" r="106045" b="73025"/>
+            <wp:docPr id="4" name="Immagine 4"/>
+            <wp:cNvGraphicFramePr>
+              <a:graphicFrameLocks xmlns:a="http://schemas.openxmlformats.org/drawingml/2006/main" noChangeAspect="1"/>
+            </wp:cNvGraphicFramePr>
+            <a:graphic xmlns:a="http://schemas.openxmlformats.org/drawingml/2006/main">
+              <a:graphicData uri="http://schemas.openxmlformats.org/drawingml/2006/picture">
+                <pic:pic xmlns:pic="http://schemas.openxmlformats.org/drawingml/2006/picture">
+                  <pic:nvPicPr>
+                    <pic:cNvPr id="1" name=""/>
+                    <pic:cNvPicPr/>
+                  </pic:nvPicPr>
+                  <pic:blipFill>
+                    <a:blip r:embed="rId15"/>
+                    <a:stretch>
+                      <a:fillRect/>
+                    </a:stretch>
+                  </pic:blipFill>
+                  <pic:spPr>
+                    <a:xfrm>
+                      <a:off x="0" y="0"/>
+                      <a:ext cx="6543886" cy="1224178"/>
+                    </a:xfrm>
+                    <a:prstGeom prst="rect">
+                      <a:avLst/>
+                    </a:prstGeom>
+                    <a:effectLst>
+                      <a:outerShdw blurRad="63500" sx="102000" sy="102000" algn="ctr" rotWithShape="0">
+                        <a:prstClr val="black">
+                          <a:alpha val="40000"/>
+                        </a:prstClr>
+                      </a:outerShdw>
+                    </a:effectLst>
+                  </pic:spPr>
+                </pic:pic>
+              </a:graphicData>
+            </a:graphic>
+          </wp:inline>
+        </w:drawing>
+      </w:r>
+    </w:p>
+    <w:p>
+      <w:r>
+        <w:br w:type="page"/>
+      </w:r>
+    </w:p>
+    <w:p>
+      <w:pPr>
+        <w:pStyle w:val="Titolo1"/>
+        <w:rPr>
+          <w:u w:val="single"/>
+        </w:rPr>
+      </w:pPr>
+      <w:bookmarkStart w:id="6" w:name="_Toc193895993"/>
+      <w:bookmarkStart w:id="7" w:name="_GoBack"/>
+      <w:r>
+        <w:rPr>
+          <w:u w:val="single"/>
+        </w:rPr>
+        <w:lastRenderedPageBreak/>
+        <w:t>Popolamento dati</w:t>
+      </w:r>
+      <w:bookmarkEnd w:id="6"/>
+    </w:p>
+    <w:bookmarkEnd w:id="7"/>
+    <w:p>
+      <w:pPr>
+        <w:rPr>
+          <w:lang w:val="it-IT"/>
+        </w:rPr>
+      </w:pPr>
+      <w:r>
+        <w:rPr>
+          <w:lang w:val="it-IT"/>
+        </w:rPr>
+        <w:t>In questo capitolo viene spiegato la struttura delle cartelle e dei file che permettono una interazione con il database come: popolamento di dati fittizi e creazione della struttura del database.</w:t>
+      </w:r>
+    </w:p>
+    <w:p>
+      <w:pPr>
+        <w:pStyle w:val="Titolo2"/>
+        <w:rPr>
+          <w:u w:val="single"/>
+        </w:rPr>
+      </w:pPr>
+      <w:bookmarkStart w:id="8" w:name="_Toc193895994"/>
+      <w:proofErr w:type="spellStart"/>
+      <w:r>
+        <w:rPr>
+          <w:u w:val="single"/>
+        </w:rPr>
+        <w:t>Migrations</w:t>
+      </w:r>
+      <w:bookmarkEnd w:id="8"/>
+      <w:proofErr w:type="spellEnd"/>
+    </w:p>
+    <w:p>
+      <w:pPr>
+        <w:spacing w:after="240"/>
+      </w:pPr>
+      <w:r>
+        <w:t xml:space="preserve">Le </w:t>
+      </w:r>
+      <w:proofErr w:type="spellStart"/>
+      <w:r>
+        <w:t>migrations</w:t>
+      </w:r>
+      <w:proofErr w:type="spellEnd"/>
+      <w:r>
+        <w:t xml:space="preserve"> sono file PHP che definiscono la struttura del database (tabelle, colonne, indici, relazioni)</w:t>
+      </w:r>
+      <w:r>
+        <w:t>. Mettono a disposizione delle funzioni principali, come c</w:t>
+      </w:r>
+      <w:r>
+        <w:t>reare, modificare o eliminare tabelle e colonne.</w:t>
+      </w:r>
+      <w:r>
+        <w:t xml:space="preserve"> Dunque al loro interno è possibile definire la struttura del Database.</w:t>
+      </w:r>
+    </w:p>
+    <w:p>
+      <w:pPr>
+        <w:spacing w:after="240"/>
+      </w:pPr>
+      <w:r>
+        <w:t>All’interno del file sono presenti due funzioni:</w:t>
+      </w:r>
+    </w:p>
+    <w:p>
+      <w:pPr>
+        <w:spacing w:after="240"/>
+        <w:rPr>
+          <w:b/>
+        </w:rPr>
+      </w:pPr>
+      <w:r>
+        <w:rPr>
+          <w:b/>
+        </w:rPr>
+        <w:t>up</w:t>
+      </w:r>
+      <w:r>
+        <w:rPr>
+          <w:b/>
+        </w:rPr>
+        <w:t>()</w:t>
+      </w:r>
+      <w:r>
+        <w:rPr>
+          <w:b/>
+        </w:rPr>
+        <w:t>:</w:t>
+      </w:r>
+      <w:r>
+        <w:rPr>
+          <w:b/>
+        </w:rPr>
+        <w:t xml:space="preserve"> </w:t>
+      </w:r>
+      <w:r>
+        <w:t>È responsabile della creazione degli schemi.</w:t>
+      </w:r>
+    </w:p>
+    <w:p>
+      <w:pPr>
+        <w:pStyle w:val="Code"/>
+        <w:ind w:left="360"/>
+        <w:rPr>
+          <w:sz w:val="16"/>
+          <w:szCs w:val="16"/>
+          <w:lang w:val="fr-CH"/>
+        </w:rPr>
+      </w:pPr>
+      <w:r>
+        <w:rPr>
+          <w:sz w:val="16"/>
+          <w:szCs w:val="16"/>
+          <w:lang w:val="fr-CH"/>
+        </w:rPr>
+        <w:t>public function up(): void</w:t>
+      </w:r>
+    </w:p>
+    <w:p>
+      <w:pPr>
+        <w:pStyle w:val="Code"/>
+        <w:ind w:left="360"/>
+        <w:rPr>
+          <w:sz w:val="16"/>
+          <w:szCs w:val="16"/>
+          <w:lang w:val="fr-CH"/>
+        </w:rPr>
+      </w:pPr>
+      <w:r>
+        <w:rPr>
+          <w:sz w:val="16"/>
+          <w:szCs w:val="16"/>
+          <w:lang w:val="fr-CH"/>
+        </w:rPr>
+        <w:t>{</w:t>
+      </w:r>
+    </w:p>
+    <w:p>
+      <w:pPr>
+        <w:pStyle w:val="Code"/>
+        <w:ind w:left="360"/>
+        <w:rPr>
+          <w:sz w:val="16"/>
+          <w:szCs w:val="16"/>
+          <w:lang w:val="fr-CH"/>
+        </w:rPr>
+      </w:pPr>
+      <w:r>
+        <w:rPr>
+          <w:sz w:val="16"/>
+          <w:szCs w:val="16"/>
+          <w:lang w:val="fr-CH"/>
+        </w:rPr>
+        <w:t xml:space="preserve">    Schema::create('user_roles', function (Blueprint $table) {</w:t>
+      </w:r>
+    </w:p>
+    <w:p>
+      <w:pPr>
+        <w:pStyle w:val="Code"/>
+        <w:ind w:left="360"/>
+        <w:rPr>
+          <w:sz w:val="16"/>
+          <w:szCs w:val="16"/>
+          <w:lang w:val="fr-CH"/>
+        </w:rPr>
+      </w:pPr>
+      <w:r>
+        <w:rPr>
+          <w:sz w:val="16"/>
+          <w:szCs w:val="16"/>
+          <w:lang w:val="fr-CH"/>
+        </w:rPr>
+        <w:t xml:space="preserve">        $table-&gt;id();</w:t>
+      </w:r>
+    </w:p>
+    <w:p>
+      <w:pPr>
+        <w:pStyle w:val="Code"/>
+        <w:ind w:left="360"/>
+        <w:rPr>
+          <w:sz w:val="16"/>
+          <w:szCs w:val="16"/>
+          <w:lang w:val="fr-CH"/>
+        </w:rPr>
+      </w:pPr>
+      <w:r>
+        <w:rPr>
+          <w:sz w:val="16"/>
+          <w:szCs w:val="16"/>
+          <w:lang w:val="fr-CH"/>
+        </w:rPr>
+        <w:t xml:space="preserve">        $table-&gt;string('name');</w:t>
+      </w:r>
+    </w:p>
+    <w:p>
+      <w:pPr>
+        <w:pStyle w:val="Code"/>
+        <w:ind w:left="360"/>
+        <w:rPr>
+          <w:sz w:val="16"/>
+          <w:szCs w:val="16"/>
+          <w:lang w:val="it-CH"/>
+        </w:rPr>
+      </w:pPr>
+      <w:r>
+        <w:rPr>
+          <w:sz w:val="16"/>
+          <w:szCs w:val="16"/>
+          <w:lang w:val="fr-CH"/>
+        </w:rPr>
+        <w:t xml:space="preserve">    </w:t>
+      </w:r>
+      <w:r>
+        <w:rPr>
+          <w:sz w:val="16"/>
+          <w:szCs w:val="16"/>
+          <w:lang w:val="it-CH"/>
+        </w:rPr>
+        <w:t>});</w:t>
+      </w:r>
+    </w:p>
+    <w:p>
+      <w:pPr>
+        <w:pStyle w:val="Code"/>
+        <w:ind w:left="360"/>
+        <w:rPr>
+          <w:sz w:val="16"/>
+          <w:szCs w:val="16"/>
+          <w:lang w:val="it-CH"/>
+        </w:rPr>
+      </w:pPr>
+      <w:r>
+        <w:rPr>
+          <w:sz w:val="16"/>
+          <w:szCs w:val="16"/>
+          <w:lang w:val="it-CH"/>
+        </w:rPr>
+        <w:t>}</w:t>
+      </w:r>
+    </w:p>
+    <w:p>
+      <w:pPr>
+        <w:spacing w:before="240" w:after="240"/>
+        <w:rPr>
+          <w:b/>
+          <w:lang w:val="it-IT"/>
+        </w:rPr>
+      </w:pPr>
+      <w:r>
+        <w:rPr>
+          <w:b/>
+          <w:lang w:val="it-IT"/>
+        </w:rPr>
+        <w:t>d</w:t>
+      </w:r>
+      <w:r>
+        <w:rPr>
+          <w:b/>
+          <w:lang w:val="it-IT"/>
+        </w:rPr>
+        <w:t>own</w:t>
+      </w:r>
+      <w:r>
+        <w:rPr>
+          <w:b/>
+          <w:lang w:val="it-IT"/>
+        </w:rPr>
+        <w:t xml:space="preserve">(): </w:t>
+      </w:r>
+      <w:r>
+        <w:rPr>
+          <w:lang w:val="it-IT"/>
+        </w:rPr>
+        <w:t>Si occupa di eliminare lo schema se già esistente.</w:t>
+      </w:r>
+    </w:p>
+    <w:p>
+      <w:pPr>
+        <w:pStyle w:val="Code"/>
+        <w:ind w:left="360"/>
+        <w:rPr>
+          <w:sz w:val="16"/>
+          <w:szCs w:val="16"/>
+          <w:lang w:val="fr-CH"/>
+        </w:rPr>
+      </w:pPr>
+      <w:r>
+        <w:rPr>
+          <w:sz w:val="16"/>
+          <w:szCs w:val="16"/>
+          <w:lang w:val="fr-CH"/>
+        </w:rPr>
+        <w:t>public function down(): void</w:t>
+      </w:r>
+    </w:p>
+    <w:p>
+      <w:pPr>
+        <w:pStyle w:val="Code"/>
+        <w:ind w:left="360"/>
+        <w:rPr>
+          <w:sz w:val="16"/>
+          <w:szCs w:val="16"/>
+          <w:lang w:val="fr-CH"/>
+        </w:rPr>
+      </w:pPr>
+      <w:r>
+        <w:rPr>
+          <w:sz w:val="16"/>
+          <w:szCs w:val="16"/>
+          <w:lang w:val="fr-CH"/>
+        </w:rPr>
+        <w:t>{</w:t>
+      </w:r>
+    </w:p>
+    <w:p>
+      <w:pPr>
+        <w:pStyle w:val="Code"/>
+        <w:ind w:left="360"/>
+        <w:rPr>
+          <w:sz w:val="16"/>
+          <w:szCs w:val="16"/>
+          <w:lang w:val="fr-CH"/>
+        </w:rPr>
+      </w:pPr>
+      <w:r>
+        <w:rPr>
+          <w:sz w:val="16"/>
+          <w:szCs w:val="16"/>
+          <w:lang w:val="fr-CH"/>
+        </w:rPr>
+        <w:t xml:space="preserve">    Schema::dropIfExists('user_roles');</w:t>
+      </w:r>
+    </w:p>
+    <w:p>
+      <w:pPr>
+        <w:pStyle w:val="Code"/>
+        <w:ind w:left="360"/>
+        <w:rPr>
+          <w:sz w:val="16"/>
+          <w:szCs w:val="16"/>
+          <w:lang w:val="it-CH"/>
+        </w:rPr>
+      </w:pPr>
+      <w:r>
+        <w:rPr>
+          <w:sz w:val="16"/>
+          <w:szCs w:val="16"/>
+          <w:lang w:val="it-CH"/>
+        </w:rPr>
+        <w:t>}</w:t>
+      </w:r>
+    </w:p>
+    <w:p>
+      <w:pPr>
+        <w:spacing w:before="240" w:after="240"/>
+      </w:pPr>
+      <w:r>
+        <w:t>Comando per eseguire le migrazioni:</w:t>
+      </w:r>
+    </w:p>
+    <w:p>
+      <w:pPr>
+        <w:pStyle w:val="Code"/>
+        <w:ind w:left="360"/>
+        <w:rPr>
+          <w:sz w:val="16"/>
+          <w:szCs w:val="16"/>
+        </w:rPr>
+      </w:pPr>
+      <w:r>
+        <w:rPr>
+          <w:sz w:val="16"/>
+          <w:szCs w:val="16"/>
+        </w:rPr>
+        <w:t>php artisan migrat</w:t>
+      </w:r>
+      <w:r>
+        <w:rPr>
+          <w:sz w:val="16"/>
+          <w:szCs w:val="16"/>
+        </w:rPr>
+        <w:t>e</w:t>
+      </w:r>
+    </w:p>
+    <w:p>
+      <w:pPr>
+        <w:spacing w:before="240" w:after="240"/>
+        <w:rPr>
+          <w:lang w:val="it-IT"/>
+        </w:rPr>
+      </w:pPr>
+      <w:r>
+        <w:rPr>
+          <w:lang w:val="it-IT"/>
+        </w:rPr>
+        <w:t>Nel caso che si voglia eseguire una migrazione specifica di un file si può eseguire il seguente comando:</w:t>
+      </w:r>
+    </w:p>
+    <w:p>
+      <w:pPr>
+        <w:pStyle w:val="Code"/>
+        <w:ind w:left="360"/>
+        <w:rPr>
+          <w:sz w:val="16"/>
+          <w:szCs w:val="16"/>
+          <w:lang w:val="fr-CH"/>
+        </w:rPr>
+      </w:pPr>
+      <w:r>
+        <w:rPr>
+          <w:sz w:val="16"/>
+          <w:szCs w:val="16"/>
+          <w:lang w:val="fr-CH"/>
+        </w:rPr>
+        <w:t>php artisan migrate --path=database/migrations/2025_03_12_120246_user_roles.php</w:t>
+      </w:r>
+    </w:p>
+    <w:p>
+      <w:pPr>
+        <w:rPr>
+          <w:lang w:val="fr-CH"/>
+        </w:rPr>
+      </w:pPr>
+      <w:r>
+        <w:rPr>
+          <w:lang w:val="fr-CH"/>
+        </w:rPr>
+        <w:br w:type="page"/>
+      </w:r>
+    </w:p>
+    <w:p>
+      <w:pPr>
+        <w:pStyle w:val="Titolo2"/>
+        <w:rPr>
+          <w:u w:val="single"/>
+        </w:rPr>
+      </w:pPr>
+      <w:bookmarkStart w:id="9" w:name="_Toc193895995"/>
+      <w:proofErr w:type="spellStart"/>
+      <w:r>
+        <w:rPr>
+          <w:u w:val="single"/>
+        </w:rPr>
+        <w:lastRenderedPageBreak/>
+        <w:t>Factories</w:t>
+      </w:r>
+      <w:bookmarkEnd w:id="9"/>
+      <w:proofErr w:type="spellEnd"/>
+    </w:p>
+    <w:p>
+      <w:r>
+        <w:t xml:space="preserve">Le </w:t>
+      </w:r>
+      <w:proofErr w:type="spellStart"/>
+      <w:r>
+        <w:t>factories</w:t>
+      </w:r>
+      <w:proofErr w:type="spellEnd"/>
+      <w:r>
+        <w:t xml:space="preserve"> sono classi PHP che generano </w:t>
+      </w:r>
+      <w:r>
+        <w:rPr>
+          <w:bCs/>
+        </w:rPr>
+        <w:t>dati fittizi</w:t>
+      </w:r>
+      <w:r>
+        <w:t xml:space="preserve"> per i </w:t>
+      </w:r>
+      <w:r>
+        <w:t xml:space="preserve">model (con l’ausilio di </w:t>
+      </w:r>
+      <w:proofErr w:type="spellStart"/>
+      <w:r>
+        <w:t>Faker</w:t>
+      </w:r>
+      <w:proofErr w:type="spellEnd"/>
+      <w:r>
+        <w:t xml:space="preserve">, ovvero una libreria PHP integrata in </w:t>
+      </w:r>
+      <w:proofErr w:type="spellStart"/>
+      <w:r>
+        <w:t>Laravel</w:t>
+      </w:r>
+      <w:proofErr w:type="spellEnd"/>
+      <w:r>
+        <w:t>). Questi sono u</w:t>
+      </w:r>
+      <w:r>
+        <w:t>tili per testing o popola</w:t>
+      </w:r>
+      <w:r>
+        <w:t>zione</w:t>
+      </w:r>
+      <w:r>
+        <w:t xml:space="preserve"> il database con dati di </w:t>
+      </w:r>
+      <w:r>
+        <w:t>prova</w:t>
+      </w:r>
+      <w:r>
+        <w:t>.</w:t>
+      </w:r>
+      <w:r>
+        <w:t xml:space="preserve"> Esse hanno già dei metodi predefiniti che permetto, ad esempio di d</w:t>
+      </w:r>
+      <w:r>
+        <w:t>efinire campi casuali ma realistici (nomi, email, date)</w:t>
+      </w:r>
+      <w:r>
+        <w:t>.</w:t>
+      </w:r>
+    </w:p>
+    <w:p>
+      <w:pPr>
+        <w:spacing w:before="240" w:after="240"/>
+      </w:pPr>
+      <w:r>
+        <w:t xml:space="preserve">Ad esempio, la </w:t>
+      </w:r>
+      <w:proofErr w:type="spellStart"/>
+      <w:r>
+        <w:t>factory</w:t>
+      </w:r>
+      <w:proofErr w:type="spellEnd"/>
+      <w:r>
+        <w:t xml:space="preserve"> per popolare un utente con dati fittizi, sarebbe la seguente:</w:t>
+      </w:r>
+    </w:p>
+    <w:p>
+      <w:pPr>
+        <w:pStyle w:val="Code"/>
+        <w:ind w:left="360"/>
+        <w:rPr>
+          <w:sz w:val="16"/>
+          <w:szCs w:val="16"/>
+          <w:lang w:val="fr-CH"/>
+        </w:rPr>
+      </w:pPr>
+      <w:r>
+        <w:rPr>
+          <w:sz w:val="16"/>
+          <w:szCs w:val="16"/>
+          <w:lang w:val="fr-CH"/>
+        </w:rPr>
+        <w:t>public function definition(): array</w:t>
+      </w:r>
+    </w:p>
+    <w:p>
+      <w:pPr>
+        <w:pStyle w:val="Code"/>
+        <w:ind w:left="360"/>
+        <w:rPr>
+          <w:sz w:val="16"/>
+          <w:szCs w:val="16"/>
+          <w:lang w:val="fr-CH"/>
+        </w:rPr>
+      </w:pPr>
+      <w:r>
+        <w:rPr>
+          <w:sz w:val="16"/>
+          <w:szCs w:val="16"/>
+          <w:lang w:val="fr-CH"/>
+        </w:rPr>
+        <w:t>{</w:t>
+      </w:r>
+    </w:p>
+    <w:p>
+      <w:pPr>
+        <w:pStyle w:val="Code"/>
+        <w:ind w:left="360"/>
+        <w:rPr>
+          <w:sz w:val="16"/>
+          <w:szCs w:val="16"/>
+          <w:lang w:val="fr-CH"/>
+        </w:rPr>
+      </w:pPr>
+      <w:r>
+        <w:rPr>
+          <w:sz w:val="16"/>
+          <w:szCs w:val="16"/>
+          <w:lang w:val="fr-CH"/>
+        </w:rPr>
+        <w:t xml:space="preserve">    return [</w:t>
+      </w:r>
+    </w:p>
+    <w:p>
+      <w:pPr>
+        <w:pStyle w:val="Code"/>
+        <w:ind w:left="360"/>
+        <w:rPr>
+          <w:sz w:val="16"/>
+          <w:szCs w:val="16"/>
+        </w:rPr>
+      </w:pPr>
+      <w:r>
+        <w:rPr>
+          <w:sz w:val="16"/>
+          <w:szCs w:val="16"/>
+          <w:lang w:val="fr-CH"/>
+        </w:rPr>
+        <w:t xml:space="preserve">        </w:t>
+      </w:r>
+      <w:r>
+        <w:rPr>
+          <w:sz w:val="16"/>
+          <w:szCs w:val="16"/>
+        </w:rPr>
+        <w:t>'name' =&gt; fake()-&gt;name(),</w:t>
+      </w:r>
+    </w:p>
+    <w:p>
+      <w:pPr>
+        <w:pStyle w:val="Code"/>
+        <w:ind w:left="360"/>
+        <w:rPr>
+          <w:sz w:val="16"/>
+          <w:szCs w:val="16"/>
+        </w:rPr>
+      </w:pPr>
+      <w:r>
+        <w:rPr>
+          <w:sz w:val="16"/>
+          <w:szCs w:val="16"/>
+        </w:rPr>
+        <w:t xml:space="preserve">        'surname' =&gt; fake()-&gt;lastName(),</w:t>
+      </w:r>
+    </w:p>
+    <w:p>
+      <w:pPr>
+        <w:pStyle w:val="Code"/>
+        <w:ind w:left="360"/>
+        <w:rPr>
+          <w:sz w:val="16"/>
+          <w:szCs w:val="16"/>
+        </w:rPr>
+      </w:pPr>
+      <w:r>
+        <w:rPr>
+          <w:sz w:val="16"/>
+          <w:szCs w:val="16"/>
+        </w:rPr>
+        <w:t xml:space="preserve">        'username' =&gt; fake()-&gt;userName(),</w:t>
+      </w:r>
+    </w:p>
+    <w:p>
+      <w:pPr>
+        <w:pStyle w:val="Code"/>
+        <w:ind w:left="360"/>
+        <w:rPr>
+          <w:sz w:val="16"/>
+          <w:szCs w:val="16"/>
+        </w:rPr>
+      </w:pPr>
+      <w:r>
+        <w:rPr>
+          <w:sz w:val="16"/>
+          <w:szCs w:val="16"/>
+        </w:rPr>
+        <w:t xml:space="preserve">        'born_date' =&gt; fake()-&gt;dateTimeBetween('-100 years', '-18 years')-&gt;format('Y-m-d'),</w:t>
+      </w:r>
+    </w:p>
+    <w:p>
+      <w:pPr>
+        <w:pStyle w:val="Code"/>
+        <w:ind w:left="360"/>
+        <w:rPr>
+          <w:sz w:val="16"/>
+          <w:szCs w:val="16"/>
+          <w:lang w:val="fr-CH"/>
+        </w:rPr>
+      </w:pPr>
+      <w:r>
+        <w:rPr>
+          <w:sz w:val="16"/>
+          <w:szCs w:val="16"/>
+        </w:rPr>
+        <w:t xml:space="preserve">        </w:t>
+      </w:r>
+      <w:r>
+        <w:rPr>
+          <w:sz w:val="16"/>
+          <w:szCs w:val="16"/>
+          <w:lang w:val="fr-CH"/>
+        </w:rPr>
+        <w:t>'address' =&gt; fake()-&gt;address(),</w:t>
+      </w:r>
+    </w:p>
+    <w:p>
+      <w:pPr>
+        <w:pStyle w:val="Code"/>
+        <w:ind w:left="360"/>
+        <w:rPr>
+          <w:sz w:val="16"/>
+          <w:szCs w:val="16"/>
+          <w:lang w:val="fr-CH"/>
+        </w:rPr>
+      </w:pPr>
+      <w:r>
+        <w:rPr>
+          <w:sz w:val="16"/>
+          <w:szCs w:val="16"/>
+          <w:lang w:val="fr-CH"/>
+        </w:rPr>
+        <w:t xml:space="preserve">        'postcode' =&gt; preg_replace('/[^0-9]/', '', fake()-&gt;postcode()),</w:t>
+      </w:r>
+    </w:p>
+    <w:p>
+      <w:pPr>
+        <w:pStyle w:val="Code"/>
+        <w:ind w:left="360"/>
+        <w:rPr>
+          <w:sz w:val="16"/>
+          <w:szCs w:val="16"/>
+          <w:lang w:val="fr-CH"/>
+        </w:rPr>
+      </w:pPr>
+      <w:r>
+        <w:rPr>
+          <w:sz w:val="16"/>
+          <w:szCs w:val="16"/>
+          <w:lang w:val="fr-CH"/>
+        </w:rPr>
+        <w:t xml:space="preserve">        'city' =&gt; fake()-&gt;city(),</w:t>
+      </w:r>
+    </w:p>
+    <w:p>
+      <w:pPr>
+        <w:pStyle w:val="Code"/>
+        <w:ind w:left="360"/>
+        <w:rPr>
+          <w:sz w:val="16"/>
+          <w:szCs w:val="16"/>
+          <w:lang w:val="fr-CH"/>
+        </w:rPr>
+      </w:pPr>
+      <w:r>
+        <w:rPr>
+          <w:sz w:val="16"/>
+          <w:szCs w:val="16"/>
+          <w:lang w:val="fr-CH"/>
+        </w:rPr>
+        <w:t xml:space="preserve">        'country' =&gt; fake()-&gt;country(),</w:t>
+      </w:r>
+    </w:p>
+    <w:p>
+      <w:pPr>
+        <w:pStyle w:val="Code"/>
+        <w:ind w:left="360"/>
+        <w:rPr>
+          <w:sz w:val="16"/>
+          <w:szCs w:val="16"/>
+          <w:lang w:val="fr-CH"/>
+        </w:rPr>
+      </w:pPr>
+      <w:r>
+        <w:rPr>
+          <w:sz w:val="16"/>
+          <w:szCs w:val="16"/>
+          <w:lang w:val="fr-CH"/>
+        </w:rPr>
+        <w:t xml:space="preserve">        'phone' =&gt; fake()-&gt;phoneNumber(),</w:t>
+      </w:r>
+    </w:p>
+    <w:p>
+      <w:pPr>
+        <w:pStyle w:val="Code"/>
+        <w:ind w:left="360"/>
+        <w:rPr>
+          <w:sz w:val="16"/>
+          <w:szCs w:val="16"/>
+          <w:lang w:val="fr-CH"/>
+        </w:rPr>
+      </w:pPr>
+      <w:r>
+        <w:rPr>
+          <w:sz w:val="16"/>
+          <w:szCs w:val="16"/>
+          <w:lang w:val="fr-CH"/>
+        </w:rPr>
+        <w:t xml:space="preserve">        'email' =&gt; fake()-&gt;unique()-&gt;safeEmail(),</w:t>
+      </w:r>
+    </w:p>
+    <w:p>
+      <w:pPr>
+        <w:pStyle w:val="Code"/>
+        <w:ind w:left="360"/>
+        <w:rPr>
+          <w:sz w:val="16"/>
+          <w:szCs w:val="16"/>
+          <w:lang w:val="fr-CH"/>
+        </w:rPr>
+      </w:pPr>
+      <w:r>
+        <w:rPr>
+          <w:sz w:val="16"/>
+          <w:szCs w:val="16"/>
+          <w:lang w:val="fr-CH"/>
+        </w:rPr>
+        <w:t xml:space="preserve">        'password' =&gt; static::$password ??= Hash::make('password'),</w:t>
+      </w:r>
+    </w:p>
+    <w:p>
+      <w:pPr>
+        <w:pStyle w:val="Code"/>
+        <w:ind w:left="360"/>
+        <w:rPr>
+          <w:sz w:val="16"/>
+          <w:szCs w:val="16"/>
+        </w:rPr>
+      </w:pPr>
+      <w:r>
+        <w:rPr>
+          <w:sz w:val="16"/>
+          <w:szCs w:val="16"/>
+          <w:lang w:val="fr-CH"/>
+        </w:rPr>
+        <w:t xml:space="preserve">        </w:t>
+      </w:r>
+      <w:r>
+        <w:rPr>
+          <w:sz w:val="16"/>
+          <w:szCs w:val="16"/>
+        </w:rPr>
+        <w:t>'role_id' =&gt; 3,</w:t>
+      </w:r>
+    </w:p>
+    <w:p>
+      <w:pPr>
+        <w:pStyle w:val="Code"/>
+        <w:ind w:left="360"/>
+        <w:rPr>
+          <w:sz w:val="16"/>
+          <w:szCs w:val="16"/>
+        </w:rPr>
+      </w:pPr>
+      <w:r>
+        <w:rPr>
+          <w:sz w:val="16"/>
+          <w:szCs w:val="16"/>
+        </w:rPr>
+        <w:t xml:space="preserve">    ];</w:t>
+      </w:r>
+    </w:p>
+    <w:p>
+      <w:pPr>
+        <w:pStyle w:val="Code"/>
+        <w:ind w:left="360"/>
+        <w:rPr>
+          <w:sz w:val="16"/>
+          <w:szCs w:val="16"/>
+        </w:rPr>
+      </w:pPr>
+      <w:r>
+        <w:rPr>
+          <w:sz w:val="16"/>
+          <w:szCs w:val="16"/>
+        </w:rPr>
+        <w:t>}</w:t>
+      </w:r>
+    </w:p>
+    <w:p>
+      <w:pPr>
+        <w:spacing w:before="240" w:after="240"/>
+      </w:pPr>
+      <w:r>
+        <w:t>Per far sì che la p</w:t>
+      </w:r>
+      <w:r>
+        <w:t xml:space="preserve">opolazione venga eseguita, si deve scrivere questa linea di codice (all’interno del </w:t>
+      </w:r>
+      <w:proofErr w:type="spellStart"/>
+      <w:r>
+        <w:t>Seeder</w:t>
+      </w:r>
+      <w:proofErr w:type="spellEnd"/>
+      <w:r>
+        <w:t>):</w:t>
+      </w:r>
+    </w:p>
+    <w:p>
+      <w:pPr>
+        <w:pStyle w:val="Code"/>
+        <w:ind w:left="360"/>
+        <w:rPr>
+          <w:sz w:val="16"/>
+          <w:szCs w:val="16"/>
+        </w:rPr>
+      </w:pPr>
+      <w:r>
+        <w:rPr>
+          <w:sz w:val="16"/>
+          <w:szCs w:val="16"/>
+        </w:rPr>
+        <w:t>User::factory()-&gt;count(</w:t>
+      </w:r>
+      <w:r>
+        <w:rPr>
+          <w:sz w:val="16"/>
+          <w:szCs w:val="16"/>
+        </w:rPr>
+        <w:t>5</w:t>
+      </w:r>
+      <w:r>
+        <w:rPr>
+          <w:sz w:val="16"/>
+          <w:szCs w:val="16"/>
+        </w:rPr>
+        <w:t xml:space="preserve">0)-&gt;create(); // Crea </w:t>
+      </w:r>
+      <w:r>
+        <w:rPr>
+          <w:sz w:val="16"/>
+          <w:szCs w:val="16"/>
+        </w:rPr>
+        <w:t>5</w:t>
+      </w:r>
+      <w:r>
+        <w:rPr>
+          <w:sz w:val="16"/>
+          <w:szCs w:val="16"/>
+        </w:rPr>
+        <w:t>0 utenti fake</w:t>
+      </w:r>
+    </w:p>
+    <w:p/>
+    <w:p>
+      <w:pPr>
+        <w:pStyle w:val="Titolo2"/>
+        <w:rPr>
+          <w:u w:val="single"/>
+        </w:rPr>
+      </w:pPr>
+      <w:bookmarkStart w:id="10" w:name="_Toc193895996"/>
+      <w:proofErr w:type="spellStart"/>
+      <w:r>
+        <w:rPr>
+          <w:u w:val="single"/>
+        </w:rPr>
+        <w:t>Seeders</w:t>
+      </w:r>
+      <w:bookmarkEnd w:id="10"/>
+      <w:proofErr w:type="spellEnd"/>
+    </w:p>
+    <w:p>
+      <w:pPr>
+        <w:spacing w:after="240"/>
+      </w:pPr>
+      <w:r>
+        <w:t xml:space="preserve">I </w:t>
+      </w:r>
+      <w:proofErr w:type="spellStart"/>
+      <w:r>
+        <w:t>seeder</w:t>
+      </w:r>
+      <w:proofErr w:type="spellEnd"/>
+      <w:r>
+        <w:t xml:space="preserve"> sono classi che utilizzano le </w:t>
+      </w:r>
+      <w:proofErr w:type="spellStart"/>
+      <w:r>
+        <w:t>factories</w:t>
+      </w:r>
+      <w:proofErr w:type="spellEnd"/>
+      <w:r>
+        <w:t xml:space="preserve"> </w:t>
+      </w:r>
+      <w:r>
+        <w:t xml:space="preserve">per </w:t>
+      </w:r>
+      <w:r>
+        <w:rPr>
+          <w:bCs/>
+        </w:rPr>
+        <w:t>popolare</w:t>
+      </w:r>
+      <w:r>
+        <w:rPr>
+          <w:b/>
+          <w:bCs/>
+        </w:rPr>
+        <w:t xml:space="preserve"> </w:t>
+      </w:r>
+      <w:r>
+        <w:rPr>
+          <w:bCs/>
+        </w:rPr>
+        <w:t>il</w:t>
+      </w:r>
+      <w:r>
+        <w:rPr>
+          <w:b/>
+          <w:bCs/>
+        </w:rPr>
+        <w:t xml:space="preserve"> </w:t>
+      </w:r>
+      <w:r>
+        <w:rPr>
+          <w:bCs/>
+        </w:rPr>
+        <w:t>database</w:t>
+      </w:r>
+      <w:r>
+        <w:t xml:space="preserve"> con dati inizial</w:t>
+      </w:r>
+      <w:r>
+        <w:t xml:space="preserve">i. Le funzioni principali sono quelle di inserimento di </w:t>
+      </w:r>
+      <w:r>
+        <w:t>dati predefiniti</w:t>
+      </w:r>
+      <w:r>
+        <w:t xml:space="preserve"> e di popolamento del database con dati per test o sviluppo.</w:t>
+      </w:r>
+    </w:p>
+    <w:p>
+      <w:pPr>
+        <w:spacing w:after="240"/>
+      </w:pPr>
+      <w:r>
+        <w:t>Esempio:</w:t>
+      </w:r>
+    </w:p>
+    <w:p>
+      <w:pPr>
+        <w:pStyle w:val="Code"/>
+        <w:ind w:left="360"/>
+        <w:rPr>
+          <w:sz w:val="16"/>
+          <w:szCs w:val="16"/>
+          <w:lang w:val="it-CH"/>
+        </w:rPr>
+      </w:pPr>
+      <w:r>
+        <w:rPr>
+          <w:sz w:val="16"/>
+          <w:szCs w:val="16"/>
+          <w:lang w:val="it-CH"/>
+        </w:rPr>
+        <w:t>User::</w:t>
+      </w:r>
+      <w:r>
+        <w:rPr>
+          <w:i/>
+          <w:iCs/>
+          <w:sz w:val="16"/>
+          <w:szCs w:val="16"/>
+          <w:lang w:val="it-CH"/>
+        </w:rPr>
+        <w:t>create</w:t>
+      </w:r>
+      <w:r>
+        <w:rPr>
+          <w:sz w:val="16"/>
+          <w:szCs w:val="16"/>
+          <w:lang w:val="it-CH"/>
+        </w:rPr>
+        <w:t>([</w:t>
+      </w:r>
+      <w:r>
+        <w:rPr>
+          <w:sz w:val="16"/>
+          <w:szCs w:val="16"/>
+          <w:lang w:val="it-CH"/>
+        </w:rPr>
+        <w:br/>
+        <w:t xml:space="preserve">    'id' =&gt; 2,</w:t>
+      </w:r>
+      <w:r>
+        <w:rPr>
+          <w:sz w:val="16"/>
+          <w:szCs w:val="16"/>
+          <w:lang w:val="it-CH"/>
+        </w:rPr>
+        <w:br/>
+        <w:t xml:space="preserve">    'name' =&gt; 'Pier',</w:t>
+      </w:r>
+      <w:r>
+        <w:rPr>
+          <w:sz w:val="16"/>
+          <w:szCs w:val="16"/>
+          <w:lang w:val="it-CH"/>
+        </w:rPr>
+        <w:br/>
+        <w:t xml:space="preserve">    'surname' =&gt; 'Telo',</w:t>
+      </w:r>
+      <w:r>
+        <w:rPr>
+          <w:sz w:val="16"/>
+          <w:szCs w:val="16"/>
+          <w:lang w:val="it-CH"/>
+        </w:rPr>
+        <w:br/>
+        <w:t xml:space="preserve">    'username' =&gt; 'vendor',</w:t>
+      </w:r>
+      <w:r>
+        <w:rPr>
+          <w:sz w:val="16"/>
+          <w:szCs w:val="16"/>
+          <w:lang w:val="it-CH"/>
+        </w:rPr>
+        <w:br/>
+        <w:t xml:space="preserve">    'born_date' =&gt; '2000-01-01',</w:t>
+      </w:r>
+      <w:r>
+        <w:rPr>
+          <w:sz w:val="16"/>
+          <w:szCs w:val="16"/>
+          <w:lang w:val="it-CH"/>
+        </w:rPr>
+        <w:br/>
+        <w:t xml:space="preserve">    'address' =&gt; 'Via Trevano 25',</w:t>
+      </w:r>
+      <w:r>
+        <w:rPr>
+          <w:sz w:val="16"/>
+          <w:szCs w:val="16"/>
+          <w:lang w:val="it-CH"/>
+        </w:rPr>
+        <w:br/>
+        <w:t xml:space="preserve">    'postcode' =&gt; 6952,</w:t>
+      </w:r>
+      <w:r>
+        <w:rPr>
+          <w:sz w:val="16"/>
+          <w:szCs w:val="16"/>
+          <w:lang w:val="it-CH"/>
+        </w:rPr>
+        <w:br/>
+        <w:t xml:space="preserve">    'city' =&gt; 'Canobbio',</w:t>
+      </w:r>
+      <w:r>
+        <w:rPr>
+          <w:sz w:val="16"/>
+          <w:szCs w:val="16"/>
+          <w:lang w:val="it-CH"/>
+        </w:rPr>
+        <w:br/>
+        <w:t xml:space="preserve">    'country' =&gt; 'Svizzera',</w:t>
+      </w:r>
+      <w:r>
+        <w:rPr>
+          <w:sz w:val="16"/>
+          <w:szCs w:val="16"/>
+          <w:lang w:val="it-CH"/>
+        </w:rPr>
+        <w:br/>
+        <w:t xml:space="preserve">    'phone' =&gt; '+41123456789',</w:t>
+      </w:r>
+      <w:r>
+        <w:rPr>
+          <w:sz w:val="16"/>
+          <w:szCs w:val="16"/>
+          <w:lang w:val="it-CH"/>
+        </w:rPr>
+        <w:br/>
+        <w:t xml:space="preserve">    'email' =&gt; 'pier.telo@samtrevano.ch',</w:t>
+      </w:r>
+      <w:r>
+        <w:rPr>
+          <w:sz w:val="16"/>
+          <w:szCs w:val="16"/>
+          <w:lang w:val="it-CH"/>
+        </w:rPr>
+        <w:br/>
+        <w:t xml:space="preserve">    'password' =&gt; Hash::make('vendor'),</w:t>
+      </w:r>
+      <w:r>
+        <w:rPr>
+          <w:sz w:val="16"/>
+          <w:szCs w:val="16"/>
+          <w:lang w:val="it-CH"/>
+        </w:rPr>
+        <w:br/>
+        <w:t xml:space="preserve">    'role_id' =&gt; 2</w:t>
+      </w:r>
+      <w:r>
+        <w:rPr>
+          <w:sz w:val="16"/>
+          <w:szCs w:val="16"/>
+          <w:lang w:val="it-CH"/>
+        </w:rPr>
+        <w:br/>
+        <w:t>]);</w:t>
+      </w:r>
+      <w:r>
+        <w:rPr>
+          <w:sz w:val="16"/>
+          <w:szCs w:val="16"/>
+          <w:lang w:val="it-CH"/>
+        </w:rPr>
+        <w:t xml:space="preserve"> // Crea utente specifico predefinito</w:t>
+      </w:r>
+      <w:r>
+        <w:rPr>
+          <w:sz w:val="16"/>
+          <w:szCs w:val="16"/>
+          <w:lang w:val="it-CH"/>
+        </w:rPr>
+        <w:br/>
+      </w:r>
+      <w:r>
+        <w:rPr>
+          <w:sz w:val="16"/>
+          <w:szCs w:val="16"/>
+          <w:lang w:val="it-CH"/>
+        </w:rPr>
+        <w:br/>
+        <w:t>User::</w:t>
+      </w:r>
+      <w:r>
+        <w:rPr>
+          <w:i/>
+          <w:iCs/>
+          <w:sz w:val="16"/>
+          <w:szCs w:val="16"/>
+          <w:lang w:val="it-CH"/>
+        </w:rPr>
+        <w:t>factory</w:t>
+      </w:r>
+      <w:r>
+        <w:rPr>
+          <w:sz w:val="16"/>
+          <w:szCs w:val="16"/>
+          <w:lang w:val="it-CH"/>
+        </w:rPr>
+        <w:t>()-&gt;count(50)-&gt;create(); // Crea 50 utenti casuali</w:t>
+      </w:r>
+    </w:p>
+    <w:p>
+      <w:pPr>
+        <w:spacing w:before="240"/>
+      </w:pPr>
+      <w:r>
+        <w:t xml:space="preserve">In questo esempio, all’interno del </w:t>
+      </w:r>
+      <w:proofErr w:type="spellStart"/>
+      <w:r>
+        <w:t>Seeder</w:t>
+      </w:r>
+      <w:proofErr w:type="spellEnd"/>
+      <w:r>
+        <w:t xml:space="preserve">, è stato creato un utente predefinito, e tramite il </w:t>
+      </w:r>
+      <w:proofErr w:type="spellStart"/>
+      <w:r>
+        <w:t>Factory</w:t>
+      </w:r>
+      <w:proofErr w:type="spellEnd"/>
+      <w:r>
+        <w:t xml:space="preserve">, sono stati creati altri 50 utenti casuali. </w:t>
+      </w:r>
+    </w:p>
+    <w:p>
+      <w:pPr>
+        <w:spacing w:before="240"/>
+      </w:pPr>
+      <w:r>
+        <w:lastRenderedPageBreak/>
+        <w:t xml:space="preserve">Comando per eseguire il </w:t>
+      </w:r>
+      <w:proofErr w:type="spellStart"/>
+      <w:r>
+        <w:t>seed</w:t>
+      </w:r>
+      <w:proofErr w:type="spellEnd"/>
+      <w:r>
+        <w:t>:</w:t>
+      </w:r>
+    </w:p>
+    <w:p>
+      <w:pPr>
+        <w:pStyle w:val="Code"/>
+        <w:spacing w:before="240"/>
+        <w:ind w:left="360"/>
+        <w:rPr>
+          <w:sz w:val="16"/>
+          <w:szCs w:val="16"/>
+          <w:lang w:val="it-CH"/>
+        </w:rPr>
+      </w:pPr>
+      <w:r>
+        <w:rPr>
+          <w:sz w:val="16"/>
+          <w:szCs w:val="16"/>
+          <w:lang w:val="it-CH"/>
+        </w:rPr>
+        <w:t>php artisan migrate --seed</w:t>
+      </w:r>
+    </w:p>
+    <w:p/>
+    <w:p>
+      <w:pPr>
+        <w:pStyle w:val="Titolo3"/>
+        <w:rPr>
+          <w:u w:val="single"/>
+        </w:rPr>
+      </w:pPr>
+      <w:bookmarkStart w:id="11" w:name="_Toc193895997"/>
+      <w:r>
+        <w:rPr>
+          <w:u w:val="single"/>
+        </w:rPr>
+        <w:t>Riassunto delle differenze</w:t>
+      </w:r>
+      <w:bookmarkEnd w:id="11"/>
+    </w:p>
+    <w:tbl>
+      <w:tblPr>
+        <w:tblStyle w:val="Grigliatabella"/>
+        <w:tblW w:w="0" w:type="auto"/>
+        <w:tblLook w:val="04A0" w:firstRow="1" w:lastRow="0" w:firstColumn="1" w:lastColumn="0" w:noHBand="0" w:noVBand="1"/>
+      </w:tblPr>
+      <w:tblGrid>
+        <w:gridCol w:w="3209"/>
+        <w:gridCol w:w="3209"/>
+        <w:gridCol w:w="3210"/>
+      </w:tblGrid>
+      <w:tr>
+        <w:tc>
+          <w:tcPr>
+            <w:tcW w:w="3209" w:type="dxa"/>
+            <w:shd w:val="clear" w:color="auto" w:fill="D9D9D9" w:themeFill="background1" w:themeFillShade="D9"/>
+          </w:tcPr>
+          <w:p>
+            <w:pPr>
+              <w:jc w:val="center"/>
+              <w:rPr>
+                <w:rFonts w:asciiTheme="minorHAnsi" w:hAnsiTheme="minorHAnsi" w:cstheme="minorHAnsi"/>
+                <w:b/>
+              </w:rPr>
+            </w:pPr>
+            <w:r>
+              <w:rPr>
+                <w:rFonts w:asciiTheme="minorHAnsi" w:hAnsiTheme="minorHAnsi" w:cstheme="minorHAnsi"/>
+                <w:b/>
+              </w:rPr>
+              <w:t>Strumento</w:t>
+            </w:r>
+          </w:p>
+        </w:tc>
+        <w:tc>
+          <w:tcPr>
+            <w:tcW w:w="3209" w:type="dxa"/>
+            <w:shd w:val="clear" w:color="auto" w:fill="D9D9D9" w:themeFill="background1" w:themeFillShade="D9"/>
+          </w:tcPr>
+          <w:p>
+            <w:pPr>
+              <w:jc w:val="center"/>
+              <w:rPr>
+                <w:rFonts w:asciiTheme="minorHAnsi" w:hAnsiTheme="minorHAnsi" w:cstheme="minorHAnsi"/>
+                <w:b/>
+              </w:rPr>
+            </w:pPr>
+            <w:r>
+              <w:rPr>
+                <w:rFonts w:asciiTheme="minorHAnsi" w:hAnsiTheme="minorHAnsi" w:cstheme="minorHAnsi"/>
+                <w:b/>
+              </w:rPr>
+              <w:t>Scopo</w:t>
+            </w:r>
+          </w:p>
+        </w:tc>
+        <w:tc>
+          <w:tcPr>
+            <w:tcW w:w="3210" w:type="dxa"/>
+            <w:shd w:val="clear" w:color="auto" w:fill="D9D9D9" w:themeFill="background1" w:themeFillShade="D9"/>
+          </w:tcPr>
+          <w:p>
+            <w:pPr>
+              <w:jc w:val="center"/>
+              <w:rPr>
+                <w:rFonts w:asciiTheme="minorHAnsi" w:hAnsiTheme="minorHAnsi" w:cstheme="minorHAnsi"/>
+                <w:b/>
+              </w:rPr>
+            </w:pPr>
+            <w:r>
+              <w:rPr>
+                <w:rFonts w:asciiTheme="minorHAnsi" w:hAnsiTheme="minorHAnsi" w:cstheme="minorHAnsi"/>
+                <w:b/>
+              </w:rPr>
+              <w:t>Esempi d’uso</w:t>
+            </w:r>
+          </w:p>
+        </w:tc>
+      </w:tr>
+      <w:tr>
+        <w:tc>
+          <w:tcPr>
+            <w:tcW w:w="3209" w:type="dxa"/>
+          </w:tcPr>
+          <w:p>
+            <w:pPr>
+              <w:rPr>
+                <w:rFonts w:asciiTheme="minorHAnsi" w:hAnsiTheme="minorHAnsi" w:cstheme="minorHAnsi"/>
+              </w:rPr>
+            </w:pPr>
+            <w:proofErr w:type="spellStart"/>
+            <w:r>
+              <w:rPr>
+                <w:rFonts w:asciiTheme="minorHAnsi" w:hAnsiTheme="minorHAnsi" w:cstheme="minorHAnsi"/>
+              </w:rPr>
+              <w:t>Migrations</w:t>
+            </w:r>
+            <w:proofErr w:type="spellEnd"/>
+          </w:p>
+        </w:tc>
+        <w:tc>
+          <w:tcPr>
+            <w:tcW w:w="3209" w:type="dxa"/>
+          </w:tcPr>
+          <w:p>
+            <w:pPr>
+              <w:rPr>
+                <w:rFonts w:asciiTheme="minorHAnsi" w:hAnsiTheme="minorHAnsi" w:cstheme="minorHAnsi"/>
+              </w:rPr>
+            </w:pPr>
+            <w:r>
+              <w:rPr>
+                <w:rFonts w:asciiTheme="minorHAnsi" w:hAnsiTheme="minorHAnsi" w:cstheme="minorHAnsi"/>
+              </w:rPr>
+              <w:t>Definire la struttura del Database</w:t>
+            </w:r>
+          </w:p>
+        </w:tc>
+        <w:tc>
+          <w:tcPr>
+            <w:tcW w:w="3210" w:type="dxa"/>
+          </w:tcPr>
+          <w:p>
+            <w:pPr>
+              <w:rPr>
+                <w:rFonts w:asciiTheme="minorHAnsi" w:hAnsiTheme="minorHAnsi" w:cstheme="minorHAnsi"/>
+              </w:rPr>
+            </w:pPr>
+            <w:r>
+              <w:rPr>
+                <w:rFonts w:asciiTheme="minorHAnsi" w:hAnsiTheme="minorHAnsi" w:cstheme="minorHAnsi"/>
+              </w:rPr>
+              <w:t>Creare tabelle, aggiungere colonne, eliminare schemi</w:t>
+            </w:r>
+          </w:p>
+        </w:tc>
+      </w:tr>
+      <w:tr>
+        <w:tc>
+          <w:tcPr>
+            <w:tcW w:w="3209" w:type="dxa"/>
+          </w:tcPr>
+          <w:p>
+            <w:pPr>
+              <w:rPr>
+                <w:rFonts w:asciiTheme="minorHAnsi" w:hAnsiTheme="minorHAnsi" w:cstheme="minorHAnsi"/>
+              </w:rPr>
+            </w:pPr>
+            <w:proofErr w:type="spellStart"/>
+            <w:r>
+              <w:rPr>
+                <w:rFonts w:asciiTheme="minorHAnsi" w:hAnsiTheme="minorHAnsi" w:cstheme="minorHAnsi"/>
+              </w:rPr>
+              <w:t>Factories</w:t>
+            </w:r>
+            <w:proofErr w:type="spellEnd"/>
+          </w:p>
+        </w:tc>
+        <w:tc>
+          <w:tcPr>
+            <w:tcW w:w="3209" w:type="dxa"/>
+          </w:tcPr>
+          <w:p>
+            <w:pPr>
+              <w:rPr>
+                <w:rFonts w:asciiTheme="minorHAnsi" w:hAnsiTheme="minorHAnsi" w:cstheme="minorHAnsi"/>
+              </w:rPr>
+            </w:pPr>
+            <w:r>
+              <w:rPr>
+                <w:rFonts w:asciiTheme="minorHAnsi" w:hAnsiTheme="minorHAnsi" w:cstheme="minorHAnsi"/>
+              </w:rPr>
+              <w:t xml:space="preserve">Generare dati </w:t>
+            </w:r>
+            <w:proofErr w:type="spellStart"/>
+            <w:r>
+              <w:rPr>
+                <w:rFonts w:asciiTheme="minorHAnsi" w:hAnsiTheme="minorHAnsi" w:cstheme="minorHAnsi"/>
+              </w:rPr>
+              <w:t>fake</w:t>
+            </w:r>
+            <w:proofErr w:type="spellEnd"/>
+          </w:p>
+        </w:tc>
+        <w:tc>
+          <w:tcPr>
+            <w:tcW w:w="3210" w:type="dxa"/>
+          </w:tcPr>
+          <w:p>
+            <w:pPr>
+              <w:rPr>
+                <w:rFonts w:asciiTheme="minorHAnsi" w:hAnsiTheme="minorHAnsi" w:cstheme="minorHAnsi"/>
+              </w:rPr>
+            </w:pPr>
+            <w:r>
+              <w:rPr>
+                <w:rFonts w:asciiTheme="minorHAnsi" w:hAnsiTheme="minorHAnsi" w:cstheme="minorHAnsi"/>
+              </w:rPr>
+              <w:t>Creare utenti con attributi casuali (nome, mail, età …)</w:t>
+            </w:r>
+          </w:p>
+        </w:tc>
+      </w:tr>
+      <w:tr>
+        <w:trPr>
+          <w:trHeight w:val="903"/>
+        </w:trPr>
+        <w:tc>
+          <w:tcPr>
+            <w:tcW w:w="3209" w:type="dxa"/>
+          </w:tcPr>
+          <w:p>
+            <w:pPr>
+              <w:rPr>
+                <w:rFonts w:asciiTheme="minorHAnsi" w:hAnsiTheme="minorHAnsi" w:cstheme="minorHAnsi"/>
+              </w:rPr>
+            </w:pPr>
+            <w:proofErr w:type="spellStart"/>
+            <w:r>
+              <w:rPr>
+                <w:rFonts w:asciiTheme="minorHAnsi" w:hAnsiTheme="minorHAnsi" w:cstheme="minorHAnsi"/>
+              </w:rPr>
+              <w:t>Seeders</w:t>
+            </w:r>
+            <w:proofErr w:type="spellEnd"/>
+          </w:p>
+        </w:tc>
+        <w:tc>
+          <w:tcPr>
+            <w:tcW w:w="3209" w:type="dxa"/>
+          </w:tcPr>
+          <w:p>
+            <w:pPr>
+              <w:rPr>
+                <w:rFonts w:asciiTheme="minorHAnsi" w:hAnsiTheme="minorHAnsi" w:cstheme="minorHAnsi"/>
+              </w:rPr>
+            </w:pPr>
+            <w:r>
+              <w:rPr>
+                <w:rFonts w:asciiTheme="minorHAnsi" w:hAnsiTheme="minorHAnsi" w:cstheme="minorHAnsi"/>
+              </w:rPr>
+              <w:t xml:space="preserve">Popolare il Database con dati iniziali predefiniti ed anche sfruttare le </w:t>
+            </w:r>
+            <w:proofErr w:type="spellStart"/>
+            <w:r>
+              <w:rPr>
+                <w:rFonts w:asciiTheme="minorHAnsi" w:hAnsiTheme="minorHAnsi" w:cstheme="minorHAnsi"/>
+              </w:rPr>
+              <w:t>Factories</w:t>
+            </w:r>
+            <w:proofErr w:type="spellEnd"/>
+            <w:r>
+              <w:rPr>
+                <w:rFonts w:asciiTheme="minorHAnsi" w:hAnsiTheme="minorHAnsi" w:cstheme="minorHAnsi"/>
+              </w:rPr>
+              <w:t xml:space="preserve"> per popolamento con dati fittizi</w:t>
+            </w:r>
+          </w:p>
+        </w:tc>
+        <w:tc>
+          <w:tcPr>
+            <w:tcW w:w="3210" w:type="dxa"/>
+          </w:tcPr>
+          <w:p>
+            <w:pPr>
+              <w:rPr>
+                <w:rFonts w:asciiTheme="minorHAnsi" w:hAnsiTheme="minorHAnsi" w:cstheme="minorHAnsi"/>
+              </w:rPr>
+            </w:pPr>
+            <w:r>
+              <w:rPr>
+                <w:rFonts w:asciiTheme="minorHAnsi" w:hAnsiTheme="minorHAnsi" w:cstheme="minorHAnsi"/>
+              </w:rPr>
+              <w:t>Inserire utenti standard (come un admin) ed altri utenti casuali</w:t>
+            </w:r>
+          </w:p>
+        </w:tc>
+      </w:tr>
+    </w:tbl>
+    <w:p/>
+    <w:p>
+      <w:pPr>
+        <w:pStyle w:val="Titolo1"/>
+        <w:rPr>
+          <w:u w:val="single"/>
+        </w:rPr>
+      </w:pPr>
+      <w:bookmarkStart w:id="12" w:name="_Toc193895998"/>
+      <w:r>
+        <w:rPr>
+          <w:u w:val="single"/>
+        </w:rPr>
+        <w:t>Struttura del progetto</w:t>
+      </w:r>
+      <w:bookmarkEnd w:id="12"/>
+    </w:p>
+    <w:p>
+      <w:pPr>
+        <w:spacing w:after="240"/>
+      </w:pPr>
+      <w:proofErr w:type="spellStart"/>
+      <w:r>
+        <w:t>Laravel</w:t>
+      </w:r>
+      <w:proofErr w:type="spellEnd"/>
+      <w:r>
+        <w:t xml:space="preserve"> ha una struttura chiara e ben organizzata. Di seguito le cartelle principali:</w:t>
+      </w:r>
+    </w:p>
+    <w:tbl>
+      <w:tblPr>
+        <w:tblStyle w:val="Grigliatabella"/>
+        <w:tblW w:w="0" w:type="auto"/>
+        <w:tblLook w:val="04A0" w:firstRow="1" w:lastRow="0" w:firstColumn="1" w:lastColumn="0" w:noHBand="0" w:noVBand="1"/>
+      </w:tblPr>
+      <w:tblGrid>
+        <w:gridCol w:w="4814"/>
+        <w:gridCol w:w="4814"/>
+      </w:tblGrid>
+      <w:tr>
+        <w:tc>
+          <w:tcPr>
+            <w:tcW w:w="4814" w:type="dxa"/>
+            <w:shd w:val="clear" w:color="auto" w:fill="D9D9D9" w:themeFill="background1" w:themeFillShade="D9"/>
+          </w:tcPr>
+          <w:p>
+            <w:pPr>
+              <w:jc w:val="center"/>
+              <w:rPr>
+                <w:b/>
+              </w:rPr>
+            </w:pPr>
+            <w:r>
+              <w:rPr>
+                <w:b/>
+              </w:rPr>
+              <w:t>Cartella</w:t>
+            </w:r>
+          </w:p>
+        </w:tc>
+        <w:tc>
+          <w:tcPr>
+            <w:tcW w:w="4814" w:type="dxa"/>
+            <w:shd w:val="clear" w:color="auto" w:fill="D9D9D9" w:themeFill="background1" w:themeFillShade="D9"/>
+          </w:tcPr>
+          <w:p>
+            <w:pPr>
+              <w:jc w:val="center"/>
+              <w:rPr>
+                <w:b/>
+              </w:rPr>
+            </w:pPr>
+            <w:r>
+              <w:rPr>
+                <w:b/>
+              </w:rPr>
+              <w:t>Descrizione</w:t>
+            </w:r>
+          </w:p>
+        </w:tc>
+      </w:tr>
+      <w:tr>
+        <w:tc>
+          <w:tcPr>
+            <w:tcW w:w="4814" w:type="dxa"/>
+          </w:tcPr>
+          <w:p>
+            <w:pPr>
+              <w:rPr>
+                <w:rFonts w:asciiTheme="minorHAnsi" w:hAnsiTheme="minorHAnsi" w:cstheme="minorHAnsi"/>
+              </w:rPr>
+            </w:pPr>
+            <w:r>
+              <w:rPr>
+                <w:rFonts w:asciiTheme="minorHAnsi" w:hAnsiTheme="minorHAnsi" w:cstheme="minorHAnsi"/>
+              </w:rPr>
+              <w:t>app/</w:t>
+            </w:r>
+          </w:p>
+        </w:tc>
+        <w:tc>
+          <w:tcPr>
+            <w:tcW w:w="4814" w:type="dxa"/>
+          </w:tcPr>
+          <w:p>
+            <w:pPr>
+              <w:rPr>
+                <w:rFonts w:asciiTheme="minorHAnsi" w:hAnsiTheme="minorHAnsi" w:cstheme="minorHAnsi"/>
+              </w:rPr>
+            </w:pPr>
+            <w:r>
+              <w:rPr>
+                <w:rFonts w:asciiTheme="minorHAnsi" w:hAnsiTheme="minorHAnsi" w:cstheme="minorHAnsi"/>
+              </w:rPr>
+              <w:t>Contiene la logica dell’applicazione (Controller, Model, Middleware)</w:t>
+            </w:r>
+          </w:p>
+        </w:tc>
+      </w:tr>
+      <w:tr>
+        <w:tc>
+          <w:tcPr>
+            <w:tcW w:w="4814" w:type="dxa"/>
+          </w:tcPr>
+          <w:p>
+            <w:pPr>
+              <w:rPr>
+                <w:rFonts w:asciiTheme="minorHAnsi" w:hAnsiTheme="minorHAnsi" w:cstheme="minorHAnsi"/>
+              </w:rPr>
+            </w:pPr>
+            <w:r>
+              <w:rPr>
+                <w:rFonts w:asciiTheme="minorHAnsi" w:hAnsiTheme="minorHAnsi" w:cstheme="minorHAnsi"/>
+              </w:rPr>
+              <w:t>bootstrap/</w:t>
+            </w:r>
+          </w:p>
+        </w:tc>
+        <w:tc>
+          <w:tcPr>
+            <w:tcW w:w="4814" w:type="dxa"/>
+          </w:tcPr>
+          <w:p>
+            <w:pPr>
+              <w:rPr>
+                <w:rFonts w:asciiTheme="minorHAnsi" w:hAnsiTheme="minorHAnsi" w:cstheme="minorHAnsi"/>
+              </w:rPr>
+            </w:pPr>
+            <w:r>
+              <w:rPr>
+                <w:rFonts w:asciiTheme="minorHAnsi" w:hAnsiTheme="minorHAnsi" w:cstheme="minorHAnsi"/>
+              </w:rPr>
+              <w:t xml:space="preserve">File di bootstrap e </w:t>
+            </w:r>
+            <w:proofErr w:type="spellStart"/>
+            <w:r>
+              <w:rPr>
+                <w:rFonts w:asciiTheme="minorHAnsi" w:hAnsiTheme="minorHAnsi" w:cstheme="minorHAnsi"/>
+              </w:rPr>
+              <w:t>autoloading</w:t>
+            </w:r>
+            <w:proofErr w:type="spellEnd"/>
+          </w:p>
+        </w:tc>
+      </w:tr>
+      <w:tr>
+        <w:tc>
+          <w:tcPr>
+            <w:tcW w:w="4814" w:type="dxa"/>
+          </w:tcPr>
+          <w:p>
+            <w:pPr>
+              <w:rPr>
+                <w:rFonts w:asciiTheme="minorHAnsi" w:hAnsiTheme="minorHAnsi" w:cstheme="minorHAnsi"/>
+              </w:rPr>
+            </w:pPr>
+            <w:proofErr w:type="spellStart"/>
+            <w:r>
+              <w:rPr>
+                <w:rFonts w:asciiTheme="minorHAnsi" w:hAnsiTheme="minorHAnsi" w:cstheme="minorHAnsi"/>
+              </w:rPr>
+              <w:t>config</w:t>
+            </w:r>
+            <w:proofErr w:type="spellEnd"/>
+            <w:r>
+              <w:rPr>
+                <w:rFonts w:asciiTheme="minorHAnsi" w:hAnsiTheme="minorHAnsi" w:cstheme="minorHAnsi"/>
+              </w:rPr>
+              <w:t>/</w:t>
+            </w:r>
+          </w:p>
+        </w:tc>
+        <w:tc>
+          <w:tcPr>
+            <w:tcW w:w="4814" w:type="dxa"/>
+          </w:tcPr>
+          <w:p>
+            <w:pPr>
+              <w:rPr>
+                <w:rFonts w:asciiTheme="minorHAnsi" w:hAnsiTheme="minorHAnsi" w:cstheme="minorHAnsi"/>
+              </w:rPr>
+            </w:pPr>
+            <w:r>
+              <w:rPr>
+                <w:rFonts w:asciiTheme="minorHAnsi" w:hAnsiTheme="minorHAnsi" w:cstheme="minorHAnsi"/>
+              </w:rPr>
+              <w:t xml:space="preserve">Configurazioni generali (Database, cache, </w:t>
+            </w:r>
+            <w:proofErr w:type="spellStart"/>
+            <w:r>
+              <w:rPr>
+                <w:rFonts w:asciiTheme="minorHAnsi" w:hAnsiTheme="minorHAnsi" w:cstheme="minorHAnsi"/>
+              </w:rPr>
+              <w:t>ecc</w:t>
+            </w:r>
+            <w:proofErr w:type="spellEnd"/>
+            <w:r>
+              <w:rPr>
+                <w:rFonts w:asciiTheme="minorHAnsi" w:hAnsiTheme="minorHAnsi" w:cstheme="minorHAnsi"/>
+              </w:rPr>
+              <w:t>…)</w:t>
+            </w:r>
+          </w:p>
+        </w:tc>
+      </w:tr>
+      <w:tr>
+        <w:tc>
+          <w:tcPr>
+            <w:tcW w:w="4814" w:type="dxa"/>
+          </w:tcPr>
+          <w:p>
+            <w:pPr>
+              <w:rPr>
+                <w:rFonts w:asciiTheme="minorHAnsi" w:hAnsiTheme="minorHAnsi" w:cstheme="minorHAnsi"/>
+              </w:rPr>
+            </w:pPr>
+            <w:r>
+              <w:rPr>
+                <w:rFonts w:asciiTheme="minorHAnsi" w:hAnsiTheme="minorHAnsi" w:cstheme="minorHAnsi"/>
+              </w:rPr>
+              <w:t>database/</w:t>
+            </w:r>
+          </w:p>
+        </w:tc>
+        <w:tc>
+          <w:tcPr>
+            <w:tcW w:w="4814" w:type="dxa"/>
+          </w:tcPr>
+          <w:p>
+            <w:pPr>
+              <w:rPr>
+                <w:rFonts w:asciiTheme="minorHAnsi" w:hAnsiTheme="minorHAnsi" w:cstheme="minorHAnsi"/>
+                <w:lang w:val="fr-CH"/>
+              </w:rPr>
+            </w:pPr>
+            <w:proofErr w:type="spellStart"/>
+            <w:r>
+              <w:rPr>
+                <w:rFonts w:asciiTheme="minorHAnsi" w:hAnsiTheme="minorHAnsi" w:cstheme="minorHAnsi"/>
+                <w:lang w:val="fr-CH"/>
+              </w:rPr>
+              <w:t>Contiene</w:t>
+            </w:r>
+            <w:proofErr w:type="spellEnd"/>
+            <w:r>
+              <w:rPr>
+                <w:rFonts w:asciiTheme="minorHAnsi" w:hAnsiTheme="minorHAnsi" w:cstheme="minorHAnsi"/>
+                <w:lang w:val="fr-CH"/>
+              </w:rPr>
+              <w:t xml:space="preserve"> le migrations, </w:t>
+            </w:r>
+            <w:proofErr w:type="spellStart"/>
+            <w:r>
+              <w:rPr>
+                <w:rFonts w:asciiTheme="minorHAnsi" w:hAnsiTheme="minorHAnsi" w:cstheme="minorHAnsi"/>
+                <w:lang w:val="fr-CH"/>
+              </w:rPr>
+              <w:t>factories</w:t>
+            </w:r>
+            <w:proofErr w:type="spellEnd"/>
+            <w:r>
+              <w:rPr>
+                <w:rFonts w:asciiTheme="minorHAnsi" w:hAnsiTheme="minorHAnsi" w:cstheme="minorHAnsi"/>
+                <w:lang w:val="fr-CH"/>
+              </w:rPr>
+              <w:t xml:space="preserve">, seeders per il </w:t>
+            </w:r>
+            <w:proofErr w:type="spellStart"/>
+            <w:r>
+              <w:rPr>
+                <w:rFonts w:asciiTheme="minorHAnsi" w:hAnsiTheme="minorHAnsi" w:cstheme="minorHAnsi"/>
+                <w:lang w:val="fr-CH"/>
+              </w:rPr>
+              <w:t>Database</w:t>
+            </w:r>
+            <w:proofErr w:type="spellEnd"/>
+          </w:p>
+        </w:tc>
+      </w:tr>
+      <w:tr>
+        <w:tc>
+          <w:tcPr>
+            <w:tcW w:w="4814" w:type="dxa"/>
+          </w:tcPr>
+          <w:p>
+            <w:pPr>
+              <w:rPr>
+                <w:rFonts w:asciiTheme="minorHAnsi" w:hAnsiTheme="minorHAnsi" w:cstheme="minorHAnsi"/>
+                <w:lang w:val="fr-CH"/>
+              </w:rPr>
+            </w:pPr>
+            <w:r>
+              <w:rPr>
+                <w:rFonts w:asciiTheme="minorHAnsi" w:hAnsiTheme="minorHAnsi" w:cstheme="minorHAnsi"/>
+                <w:lang w:val="fr-CH"/>
+              </w:rPr>
+              <w:t>public/</w:t>
+            </w:r>
+          </w:p>
+        </w:tc>
+        <w:tc>
+          <w:tcPr>
+            <w:tcW w:w="4814" w:type="dxa"/>
+          </w:tcPr>
+          <w:p>
+            <w:pPr>
+              <w:rPr>
+                <w:rFonts w:asciiTheme="minorHAnsi" w:hAnsiTheme="minorHAnsi" w:cstheme="minorHAnsi"/>
+              </w:rPr>
+            </w:pPr>
+            <w:r>
+              <w:rPr>
+                <w:rFonts w:asciiTheme="minorHAnsi" w:hAnsiTheme="minorHAnsi" w:cstheme="minorHAnsi"/>
+              </w:rPr>
+              <w:t>File pubblici (</w:t>
+            </w:r>
+            <w:proofErr w:type="spellStart"/>
+            <w:r>
+              <w:rPr>
+                <w:rFonts w:asciiTheme="minorHAnsi" w:hAnsiTheme="minorHAnsi" w:cstheme="minorHAnsi"/>
+              </w:rPr>
+              <w:t>index.php</w:t>
+            </w:r>
+            <w:proofErr w:type="spellEnd"/>
+            <w:r>
+              <w:rPr>
+                <w:rFonts w:asciiTheme="minorHAnsi" w:hAnsiTheme="minorHAnsi" w:cstheme="minorHAnsi"/>
+              </w:rPr>
+              <w:t xml:space="preserve">, immagini, </w:t>
+            </w:r>
+            <w:proofErr w:type="spellStart"/>
+            <w:r>
+              <w:rPr>
+                <w:rFonts w:asciiTheme="minorHAnsi" w:hAnsiTheme="minorHAnsi" w:cstheme="minorHAnsi"/>
+              </w:rPr>
+              <w:t>assets</w:t>
+            </w:r>
+            <w:proofErr w:type="spellEnd"/>
+            <w:r>
+              <w:rPr>
+                <w:rFonts w:asciiTheme="minorHAnsi" w:hAnsiTheme="minorHAnsi" w:cstheme="minorHAnsi"/>
+              </w:rPr>
+              <w:t>)</w:t>
+            </w:r>
+          </w:p>
+        </w:tc>
+      </w:tr>
+      <w:tr>
+        <w:tc>
+          <w:tcPr>
+            <w:tcW w:w="4814" w:type="dxa"/>
+          </w:tcPr>
+          <w:p>
+            <w:pPr>
+              <w:rPr>
+                <w:rFonts w:asciiTheme="minorHAnsi" w:hAnsiTheme="minorHAnsi" w:cstheme="minorHAnsi"/>
+              </w:rPr>
+            </w:pPr>
+            <w:r>
+              <w:rPr>
+                <w:rFonts w:asciiTheme="minorHAnsi" w:hAnsiTheme="minorHAnsi" w:cstheme="minorHAnsi"/>
+              </w:rPr>
+              <w:t>resources/</w:t>
+            </w:r>
+          </w:p>
+        </w:tc>
+        <w:tc>
+          <w:tcPr>
+            <w:tcW w:w="4814" w:type="dxa"/>
+          </w:tcPr>
+          <w:p>
+            <w:pPr>
+              <w:rPr>
+                <w:rFonts w:asciiTheme="minorHAnsi" w:hAnsiTheme="minorHAnsi" w:cstheme="minorHAnsi"/>
+                <w:lang w:val="fr-CH"/>
+              </w:rPr>
+            </w:pPr>
+            <w:proofErr w:type="spellStart"/>
+            <w:r>
+              <w:rPr>
+                <w:rFonts w:asciiTheme="minorHAnsi" w:hAnsiTheme="minorHAnsi" w:cstheme="minorHAnsi"/>
+                <w:lang w:val="fr-CH"/>
+              </w:rPr>
+              <w:t>Contiene</w:t>
+            </w:r>
+            <w:proofErr w:type="spellEnd"/>
+            <w:r>
+              <w:rPr>
+                <w:rFonts w:asciiTheme="minorHAnsi" w:hAnsiTheme="minorHAnsi" w:cstheme="minorHAnsi"/>
+                <w:lang w:val="fr-CH"/>
+              </w:rPr>
+              <w:t xml:space="preserve"> le </w:t>
+            </w:r>
+            <w:proofErr w:type="spellStart"/>
+            <w:r>
+              <w:rPr>
+                <w:rFonts w:asciiTheme="minorHAnsi" w:hAnsiTheme="minorHAnsi" w:cstheme="minorHAnsi"/>
+                <w:lang w:val="fr-CH"/>
+              </w:rPr>
+              <w:t>Views</w:t>
+            </w:r>
+            <w:proofErr w:type="spellEnd"/>
+            <w:r>
+              <w:rPr>
+                <w:rFonts w:asciiTheme="minorHAnsi" w:hAnsiTheme="minorHAnsi" w:cstheme="minorHAnsi"/>
+                <w:lang w:val="fr-CH"/>
+              </w:rPr>
+              <w:t xml:space="preserve"> (Blade), file CSS/JS</w:t>
+            </w:r>
+          </w:p>
+        </w:tc>
+      </w:tr>
+      <w:tr>
+        <w:tc>
+          <w:tcPr>
+            <w:tcW w:w="4814" w:type="dxa"/>
+          </w:tcPr>
+          <w:p>
+            <w:pPr>
+              <w:rPr>
+                <w:rFonts w:asciiTheme="minorHAnsi" w:hAnsiTheme="minorHAnsi" w:cstheme="minorHAnsi"/>
+                <w:lang w:val="fr-CH"/>
+              </w:rPr>
+            </w:pPr>
+            <w:r>
+              <w:rPr>
+                <w:rFonts w:asciiTheme="minorHAnsi" w:hAnsiTheme="minorHAnsi" w:cstheme="minorHAnsi"/>
+                <w:lang w:val="fr-CH"/>
+              </w:rPr>
+              <w:t>routes/</w:t>
+            </w:r>
+          </w:p>
+        </w:tc>
+        <w:tc>
+          <w:tcPr>
+            <w:tcW w:w="4814" w:type="dxa"/>
+          </w:tcPr>
+          <w:p>
+            <w:pPr>
+              <w:rPr>
+                <w:rFonts w:asciiTheme="minorHAnsi" w:hAnsiTheme="minorHAnsi" w:cstheme="minorHAnsi"/>
+                <w:lang w:val="fr-CH"/>
+              </w:rPr>
+            </w:pPr>
+            <w:proofErr w:type="spellStart"/>
+            <w:r>
+              <w:rPr>
+                <w:rFonts w:asciiTheme="minorHAnsi" w:hAnsiTheme="minorHAnsi" w:cstheme="minorHAnsi"/>
+                <w:lang w:val="fr-CH"/>
+              </w:rPr>
+              <w:t>Definizione</w:t>
+            </w:r>
+            <w:proofErr w:type="spellEnd"/>
+            <w:r>
+              <w:rPr>
+                <w:rFonts w:asciiTheme="minorHAnsi" w:hAnsiTheme="minorHAnsi" w:cstheme="minorHAnsi"/>
+                <w:lang w:val="fr-CH"/>
+              </w:rPr>
+              <w:t xml:space="preserve"> delle </w:t>
+            </w:r>
+            <w:proofErr w:type="spellStart"/>
+            <w:r>
+              <w:rPr>
+                <w:rFonts w:asciiTheme="minorHAnsi" w:hAnsiTheme="minorHAnsi" w:cstheme="minorHAnsi"/>
+                <w:lang w:val="fr-CH"/>
+              </w:rPr>
+              <w:t>rotte</w:t>
+            </w:r>
+            <w:proofErr w:type="spellEnd"/>
+          </w:p>
+        </w:tc>
+      </w:tr>
+      <w:tr>
+        <w:tc>
+          <w:tcPr>
+            <w:tcW w:w="4814" w:type="dxa"/>
+          </w:tcPr>
+          <w:p>
+            <w:pPr>
+              <w:rPr>
+                <w:rFonts w:asciiTheme="minorHAnsi" w:hAnsiTheme="minorHAnsi" w:cstheme="minorHAnsi"/>
+                <w:lang w:val="fr-CH"/>
+              </w:rPr>
+            </w:pPr>
+            <w:proofErr w:type="spellStart"/>
+            <w:r>
+              <w:rPr>
+                <w:rFonts w:asciiTheme="minorHAnsi" w:hAnsiTheme="minorHAnsi" w:cstheme="minorHAnsi"/>
+                <w:lang w:val="fr-CH"/>
+              </w:rPr>
+              <w:t>storage</w:t>
+            </w:r>
+            <w:proofErr w:type="spellEnd"/>
+            <w:r>
+              <w:rPr>
+                <w:rFonts w:asciiTheme="minorHAnsi" w:hAnsiTheme="minorHAnsi" w:cstheme="minorHAnsi"/>
+                <w:lang w:val="fr-CH"/>
+              </w:rPr>
+              <w:t>/</w:t>
+            </w:r>
+          </w:p>
+        </w:tc>
+        <w:tc>
+          <w:tcPr>
+            <w:tcW w:w="4814" w:type="dxa"/>
+          </w:tcPr>
+          <w:p>
+            <w:pPr>
+              <w:rPr>
+                <w:rFonts w:asciiTheme="minorHAnsi" w:hAnsiTheme="minorHAnsi" w:cstheme="minorHAnsi"/>
+              </w:rPr>
+            </w:pPr>
+            <w:r>
+              <w:rPr>
+                <w:rFonts w:asciiTheme="minorHAnsi" w:hAnsiTheme="minorHAnsi" w:cstheme="minorHAnsi"/>
+              </w:rPr>
+              <w:t xml:space="preserve">Log, </w:t>
+            </w:r>
+            <w:proofErr w:type="spellStart"/>
+            <w:r>
+              <w:rPr>
+                <w:rFonts w:asciiTheme="minorHAnsi" w:hAnsiTheme="minorHAnsi" w:cstheme="minorHAnsi"/>
+              </w:rPr>
+              <w:t>cahce</w:t>
+            </w:r>
+            <w:proofErr w:type="spellEnd"/>
+            <w:r>
+              <w:rPr>
+                <w:rFonts w:asciiTheme="minorHAnsi" w:hAnsiTheme="minorHAnsi" w:cstheme="minorHAnsi"/>
+              </w:rPr>
+              <w:t xml:space="preserve">, sessioni, file </w:t>
+            </w:r>
+            <w:proofErr w:type="spellStart"/>
+            <w:r>
+              <w:rPr>
+                <w:rFonts w:asciiTheme="minorHAnsi" w:hAnsiTheme="minorHAnsi" w:cstheme="minorHAnsi"/>
+              </w:rPr>
+              <w:t>carticati</w:t>
+            </w:r>
+            <w:proofErr w:type="spellEnd"/>
+          </w:p>
+        </w:tc>
+      </w:tr>
+      <w:tr>
+        <w:tc>
+          <w:tcPr>
+            <w:tcW w:w="4814" w:type="dxa"/>
+          </w:tcPr>
+          <w:p>
+            <w:pPr>
+              <w:rPr>
+                <w:rFonts w:asciiTheme="minorHAnsi" w:hAnsiTheme="minorHAnsi" w:cstheme="minorHAnsi"/>
+                <w:lang w:val="fr-CH"/>
+              </w:rPr>
+            </w:pPr>
+            <w:r>
+              <w:rPr>
+                <w:rFonts w:asciiTheme="minorHAnsi" w:hAnsiTheme="minorHAnsi" w:cstheme="minorHAnsi"/>
+                <w:lang w:val="fr-CH"/>
+              </w:rPr>
+              <w:t>tests/</w:t>
+            </w:r>
+          </w:p>
+        </w:tc>
+        <w:tc>
+          <w:tcPr>
+            <w:tcW w:w="4814" w:type="dxa"/>
+          </w:tcPr>
+          <w:p>
+            <w:pPr>
+              <w:rPr>
+                <w:rFonts w:asciiTheme="minorHAnsi" w:hAnsiTheme="minorHAnsi" w:cstheme="minorHAnsi"/>
+              </w:rPr>
+            </w:pPr>
+            <w:r>
+              <w:rPr>
+                <w:rFonts w:asciiTheme="minorHAnsi" w:hAnsiTheme="minorHAnsi" w:cstheme="minorHAnsi"/>
+              </w:rPr>
+              <w:t>Contiene test automatici</w:t>
+            </w:r>
+          </w:p>
+        </w:tc>
+      </w:tr>
+      <w:tr>
+        <w:tc>
+          <w:tcPr>
+            <w:tcW w:w="4814" w:type="dxa"/>
+          </w:tcPr>
+          <w:p>
+            <w:pPr>
+              <w:rPr>
+                <w:rFonts w:asciiTheme="minorHAnsi" w:hAnsiTheme="minorHAnsi" w:cstheme="minorHAnsi"/>
+                <w:lang w:val="fr-CH"/>
+              </w:rPr>
+            </w:pPr>
+            <w:r>
+              <w:rPr>
+                <w:rFonts w:asciiTheme="minorHAnsi" w:hAnsiTheme="minorHAnsi" w:cstheme="minorHAnsi"/>
+                <w:lang w:val="fr-CH"/>
+              </w:rPr>
+              <w:t>.</w:t>
+            </w:r>
+            <w:proofErr w:type="spellStart"/>
+            <w:r>
+              <w:rPr>
+                <w:rFonts w:asciiTheme="minorHAnsi" w:hAnsiTheme="minorHAnsi" w:cstheme="minorHAnsi"/>
+                <w:lang w:val="fr-CH"/>
+              </w:rPr>
+              <w:t>env</w:t>
+            </w:r>
+            <w:proofErr w:type="spellEnd"/>
+          </w:p>
+        </w:tc>
+        <w:tc>
+          <w:tcPr>
+            <w:tcW w:w="4814" w:type="dxa"/>
+          </w:tcPr>
+          <w:p>
+            <w:pPr>
+              <w:rPr>
+                <w:rFonts w:asciiTheme="minorHAnsi" w:hAnsiTheme="minorHAnsi" w:cstheme="minorHAnsi"/>
+              </w:rPr>
+            </w:pPr>
+            <w:r>
+              <w:rPr>
+                <w:rFonts w:asciiTheme="minorHAnsi" w:hAnsiTheme="minorHAnsi" w:cstheme="minorHAnsi"/>
+              </w:rPr>
+              <w:t>Configurazione dell’ambiente (DB, API ecc..)</w:t>
+            </w:r>
+          </w:p>
+        </w:tc>
+      </w:tr>
+    </w:tbl>
+    <w:p>
+      <w:pPr>
+        <w:rPr>
+          <w:b/>
+          <w:lang w:val="it-IT"/>
+        </w:rPr>
+      </w:pPr>
     </w:p>
     <w:sectPr>
-      <w:headerReference w:type="default" r:id="rId14"/>
-      <w:footerReference w:type="default" r:id="rId15"/>
+      <w:headerReference w:type="default" r:id="rId16"/>
+      <w:footerReference w:type="default" r:id="rId17"/>
       <w:pgSz w:w="11906" w:h="16838"/>
       <w:pgMar w:top="1417" w:right="1134" w:bottom="1134" w:left="1134" w:header="708" w:footer="708" w:gutter="0"/>
       <w:pgNumType w:start="0"/>
@@ -1249,14 +4491,27 @@
     <w:r>
       <w:t>/</w:t>
     </w:r>
-    <w:fldSimple w:instr=" NUMPAGES   \* MERGEFORMAT ">
-      <w:r>
-        <w:rPr>
-          <w:noProof/>
-        </w:rPr>
-        <w:t>2</w:t>
-      </w:r>
-    </w:fldSimple>
+    <w:r>
+      <w:fldChar w:fldCharType="begin"/>
+    </w:r>
+    <w:r>
+      <w:instrText xml:space="preserve"> NUMPAGES   \* MERGEFORMAT </w:instrText>
+    </w:r>
+    <w:r>
+      <w:fldChar w:fldCharType="separate"/>
+    </w:r>
+    <w:r>
+      <w:rPr>
+        <w:noProof/>
+      </w:rPr>
+      <w:t>2</w:t>
+    </w:r>
+    <w:r>
+      <w:rPr>
+        <w:noProof/>
+      </w:rPr>
+      <w:fldChar w:fldCharType="end"/>
+    </w:r>
   </w:p>
 </w:ftr>
 </file>
@@ -1300,7 +4555,10 @@
     </w:r>
     <w:r>
       <w:tab/>
-      <w:t>Documentazione Sprint 1</w:t>
+      <w:t xml:space="preserve">Documentazione Sprint </w:t>
+    </w:r>
+    <w:r>
+      <w:t>2</w:t>
     </w:r>
   </w:p>
 </w:hdr>
@@ -2583,6 +5841,117 @@
       <w:szCs w:val="18"/>
     </w:rPr>
   </w:style>
+  <w:style w:type="character" w:customStyle="1" w:styleId="CodeCarattere">
+    <w:name w:val="Code Carattere"/>
+    <w:basedOn w:val="Carpredefinitoparagrafo"/>
+    <w:link w:val="Code"/>
+    <w:locked/>
+    <w:rsid w:val="00175463"/>
+    <w:rPr>
+      <w:rFonts w:ascii="Consolas" w:hAnsi="Consolas" w:cs="Courier New"/>
+      <w:noProof/>
+      <w:color w:val="212529"/>
+      <w:shd w:val="clear" w:color="auto" w:fill="F8F9FA"/>
+      <w:lang w:val="it-IT" w:eastAsia="it-IT"/>
+    </w:rPr>
+  </w:style>
+  <w:style w:type="paragraph" w:customStyle="1" w:styleId="Code">
+    <w:name w:val="Code"/>
+    <w:basedOn w:val="PreformattatoHTML"/>
+    <w:link w:val="CodeCarattere"/>
+    <w:qFormat/>
+    <w:rsid w:val="00175463"/>
+    <w:pPr>
+      <w:pBdr>
+        <w:top w:val="single" w:sz="6" w:space="12" w:color="EAECF0"/>
+        <w:left w:val="single" w:sz="6" w:space="12" w:color="EAECF0"/>
+        <w:bottom w:val="single" w:sz="6" w:space="12" w:color="EAECF0"/>
+        <w:right w:val="single" w:sz="6" w:space="12" w:color="EAECF0"/>
+      </w:pBdr>
+      <w:shd w:val="clear" w:color="auto" w:fill="F8F9FA"/>
+      <w:tabs>
+        <w:tab w:val="left" w:pos="916"/>
+        <w:tab w:val="left" w:pos="1832"/>
+        <w:tab w:val="left" w:pos="2748"/>
+        <w:tab w:val="left" w:pos="3664"/>
+        <w:tab w:val="left" w:pos="4580"/>
+        <w:tab w:val="left" w:pos="5496"/>
+        <w:tab w:val="left" w:pos="6412"/>
+        <w:tab w:val="left" w:pos="7328"/>
+        <w:tab w:val="left" w:pos="8244"/>
+        <w:tab w:val="left" w:pos="9160"/>
+        <w:tab w:val="left" w:pos="10076"/>
+        <w:tab w:val="left" w:pos="10992"/>
+        <w:tab w:val="left" w:pos="11908"/>
+        <w:tab w:val="left" w:pos="12824"/>
+        <w:tab w:val="left" w:pos="13740"/>
+        <w:tab w:val="left" w:pos="14656"/>
+      </w:tabs>
+    </w:pPr>
+    <w:rPr>
+      <w:rFonts w:cs="Courier New"/>
+      <w:noProof/>
+      <w:color w:val="212529"/>
+      <w:sz w:val="22"/>
+      <w:szCs w:val="22"/>
+      <w:lang w:val="it-IT" w:eastAsia="it-IT"/>
+    </w:rPr>
+  </w:style>
+  <w:style w:type="paragraph" w:styleId="PreformattatoHTML">
+    <w:name w:val="HTML Preformatted"/>
+    <w:basedOn w:val="Normale"/>
+    <w:link w:val="PreformattatoHTMLCarattere"/>
+    <w:uiPriority w:val="99"/>
+    <w:semiHidden/>
+    <w:unhideWhenUsed/>
+    <w:rsid w:val="00175463"/>
+    <w:pPr>
+      <w:spacing w:after="0" w:line="240" w:lineRule="auto"/>
+    </w:pPr>
+    <w:rPr>
+      <w:rFonts w:ascii="Consolas" w:hAnsi="Consolas"/>
+      <w:sz w:val="20"/>
+      <w:szCs w:val="20"/>
+    </w:rPr>
+  </w:style>
+  <w:style w:type="character" w:customStyle="1" w:styleId="PreformattatoHTMLCarattere">
+    <w:name w:val="Preformattato HTML Carattere"/>
+    <w:basedOn w:val="Carpredefinitoparagrafo"/>
+    <w:link w:val="PreformattatoHTML"/>
+    <w:uiPriority w:val="99"/>
+    <w:semiHidden/>
+    <w:rsid w:val="00175463"/>
+    <w:rPr>
+      <w:rFonts w:ascii="Consolas" w:hAnsi="Consolas"/>
+      <w:sz w:val="20"/>
+      <w:szCs w:val="20"/>
+    </w:rPr>
+  </w:style>
+  <w:style w:type="table" w:styleId="Grigliatabella">
+    <w:name w:val="Table Grid"/>
+    <w:basedOn w:val="Tabellanormale"/>
+    <w:uiPriority w:val="39"/>
+    <w:rsid w:val="00175463"/>
+    <w:pPr>
+      <w:spacing w:after="0" w:line="240" w:lineRule="auto"/>
+    </w:pPr>
+    <w:rPr>
+      <w:rFonts w:ascii="Times New Roman" w:eastAsia="Times New Roman" w:hAnsi="Times New Roman" w:cs="Times New Roman"/>
+      <w:sz w:val="20"/>
+      <w:szCs w:val="20"/>
+      <w:lang w:eastAsia="it-CH"/>
+    </w:rPr>
+    <w:tblPr>
+      <w:tblBorders>
+        <w:top w:val="single" w:sz="4" w:space="0" w:color="auto"/>
+        <w:left w:val="single" w:sz="4" w:space="0" w:color="auto"/>
+        <w:bottom w:val="single" w:sz="4" w:space="0" w:color="auto"/>
+        <w:right w:val="single" w:sz="4" w:space="0" w:color="auto"/>
+        <w:insideH w:val="single" w:sz="4" w:space="0" w:color="auto"/>
+        <w:insideV w:val="single" w:sz="4" w:space="0" w:color="auto"/>
+      </w:tblBorders>
+    </w:tblPr>
+  </w:style>
 </w:styles>
 </file>
 
@@ -2905,7 +6274,7 @@
 </file>
 
 <file path=customXml/itemProps2.xml><?xml version="1.0" encoding="utf-8"?>
-<ds:datastoreItem xmlns:ds="http://schemas.openxmlformats.org/officeDocument/2006/customXml" ds:itemID="{61AAE55A-EA0E-48E8-B7D4-F78A345DB75C}">
+<ds:datastoreItem xmlns:ds="http://schemas.openxmlformats.org/officeDocument/2006/customXml" ds:itemID="{FF34AB52-3A66-47B7-AA46-5A2165399CA2}">
   <ds:schemaRefs>
     <ds:schemaRef ds:uri="http://schemas.openxmlformats.org/officeDocument/2006/bibliography"/>
   </ds:schemaRefs>

</xml_diff>

<commit_message>
Pagina profilo aggiornata con dettagli di spedizione
-> Non inserisce nel db mlm.
</commit_message>
<xml_diff>
--- a/3_Documentazione/Documentazione-Sprint2.docx
+++ b/3_Documentazione/Documentazione-Sprint2.docx
@@ -1717,27 +1717,14 @@
         <w:pStyle w:val="Didascalia"/>
         <w:jc w:val="center"/>
       </w:pPr>
-      <w:r>
-        <w:fldChar w:fldCharType="begin"/>
-      </w:r>
-      <w:r>
-        <w:instrText xml:space="preserve"> SEQ Figura \* ARABIC </w:instrText>
-      </w:r>
-      <w:r>
-        <w:fldChar w:fldCharType="separate"/>
-      </w:r>
-      <w:r>
-        <w:rPr>
-          <w:noProof/>
-        </w:rPr>
-        <w:t>2</w:t>
-      </w:r>
-      <w:r>
-        <w:rPr>
-          <w:noProof/>
-        </w:rPr>
-        <w:fldChar w:fldCharType="end"/>
-      </w:r>
+      <w:fldSimple w:instr=" SEQ Figura \* ARABIC ">
+        <w:r>
+          <w:rPr>
+            <w:noProof/>
+          </w:rPr>
+          <w:t>2</w:t>
+        </w:r>
+      </w:fldSimple>
       <w:r>
         <w:t xml:space="preserve"> - Pagina di Sign Up</w:t>
       </w:r>
@@ -1924,27 +1911,14 @@
         <w:pStyle w:val="Didascalia"/>
         <w:jc w:val="center"/>
       </w:pPr>
-      <w:r>
-        <w:fldChar w:fldCharType="begin"/>
-      </w:r>
-      <w:r>
-        <w:instrText xml:space="preserve"> SEQ Figura \* ARABIC </w:instrText>
-      </w:r>
-      <w:r>
-        <w:fldChar w:fldCharType="separate"/>
-      </w:r>
-      <w:r>
-        <w:rPr>
-          <w:noProof/>
-        </w:rPr>
-        <w:t>3</w:t>
-      </w:r>
-      <w:r>
-        <w:rPr>
-          <w:noProof/>
-        </w:rPr>
-        <w:fldChar w:fldCharType="end"/>
-      </w:r>
+      <w:fldSimple w:instr=" SEQ Figura \* ARABIC ">
+        <w:r>
+          <w:rPr>
+            <w:noProof/>
+          </w:rPr>
+          <w:t>3</w:t>
+        </w:r>
+      </w:fldSimple>
       <w:r>
         <w:t xml:space="preserve"> - Pagina di gestione account - sezione informazioni profilo</w:t>
       </w:r>
@@ -2013,27 +1987,14 @@
         <w:pStyle w:val="Didascalia"/>
         <w:jc w:val="center"/>
       </w:pPr>
-      <w:r>
-        <w:fldChar w:fldCharType="begin"/>
-      </w:r>
-      <w:r>
-        <w:instrText xml:space="preserve"> SEQ Figura \* ARABIC </w:instrText>
-      </w:r>
-      <w:r>
-        <w:fldChar w:fldCharType="separate"/>
-      </w:r>
-      <w:r>
-        <w:rPr>
-          <w:noProof/>
-        </w:rPr>
-        <w:t>4</w:t>
-      </w:r>
-      <w:r>
-        <w:rPr>
-          <w:noProof/>
-        </w:rPr>
-        <w:fldChar w:fldCharType="end"/>
-      </w:r>
+      <w:fldSimple w:instr=" SEQ Figura \* ARABIC ">
+        <w:r>
+          <w:rPr>
+            <w:noProof/>
+          </w:rPr>
+          <w:t>4</w:t>
+        </w:r>
+      </w:fldSimple>
       <w:r>
         <w:t xml:space="preserve"> - Pagina di gestione account - sezione di modifica password</w:t>
       </w:r>
@@ -2104,27 +2065,14 @@
         <w:pStyle w:val="Didascalia"/>
         <w:jc w:val="center"/>
       </w:pPr>
-      <w:r>
-        <w:fldChar w:fldCharType="begin"/>
-      </w:r>
-      <w:r>
-        <w:instrText xml:space="preserve"> SEQ Figura \* ARABIC </w:instrText>
-      </w:r>
-      <w:r>
-        <w:fldChar w:fldCharType="separate"/>
-      </w:r>
-      <w:r>
-        <w:rPr>
-          <w:noProof/>
-        </w:rPr>
-        <w:t>5</w:t>
-      </w:r>
-      <w:r>
-        <w:rPr>
-          <w:noProof/>
-        </w:rPr>
-        <w:fldChar w:fldCharType="end"/>
-      </w:r>
+      <w:fldSimple w:instr=" SEQ Figura \* ARABIC ">
+        <w:r>
+          <w:rPr>
+            <w:noProof/>
+          </w:rPr>
+          <w:t>5</w:t>
+        </w:r>
+      </w:fldSimple>
       <w:r>
         <w:t xml:space="preserve"> - Pagina di gestione account - sezione di eliminazione account</w:t>
       </w:r>
@@ -4650,6 +4598,16 @@
               </w:rPr>
               <w:t>REQ-</w:t>
             </w:r>
+            <w:r>
+              <w:rPr>
+                <w:rFonts w:ascii="Times New Roman" w:hAnsi="Times New Roman" w:cs="Times New Roman"/>
+                <w:sz w:val="18"/>
+                <w:szCs w:val="18"/>
+              </w:rPr>
+              <w:t>08</w:t>
+            </w:r>
+            <w:bookmarkStart w:id="13" w:name="_GoBack"/>
+            <w:bookmarkEnd w:id="13"/>
           </w:p>
         </w:tc>
         <w:tc>
@@ -5673,6 +5631,14 @@
               </w:rPr>
               <w:t>REQ-</w:t>
             </w:r>
+            <w:r>
+              <w:rPr>
+                <w:rFonts w:ascii="Times New Roman" w:hAnsi="Times New Roman" w:cs="Times New Roman"/>
+                <w:sz w:val="18"/>
+                <w:szCs w:val="18"/>
+              </w:rPr>
+              <w:t>08</w:t>
+            </w:r>
           </w:p>
         </w:tc>
         <w:tc>
@@ -6596,6 +6562,14 @@
               </w:rPr>
               <w:t>REQ-</w:t>
             </w:r>
+            <w:r>
+              <w:rPr>
+                <w:rFonts w:ascii="Times New Roman" w:hAnsi="Times New Roman" w:cs="Times New Roman"/>
+                <w:sz w:val="18"/>
+                <w:szCs w:val="18"/>
+              </w:rPr>
+              <w:t>02</w:t>
+            </w:r>
           </w:p>
         </w:tc>
         <w:tc>
@@ -7502,6 +7476,14 @@
               </w:rPr>
               <w:t>REQ-</w:t>
             </w:r>
+            <w:r>
+              <w:rPr>
+                <w:rFonts w:ascii="Times New Roman" w:hAnsi="Times New Roman" w:cs="Times New Roman"/>
+                <w:sz w:val="18"/>
+                <w:szCs w:val="18"/>
+              </w:rPr>
+              <w:t>02</w:t>
+            </w:r>
           </w:p>
         </w:tc>
         <w:tc>
@@ -7640,61 +7622,7 @@
                 <w:szCs w:val="18"/>
                 <w:lang w:val="it-IT"/>
               </w:rPr>
-              <w:t xml:space="preserve">Verificare che avendo effettuato il login come </w:t>
-            </w:r>
-            <w:r>
-              <w:rPr>
-                <w:rFonts w:ascii="Times New Roman" w:hAnsi="Times New Roman"/>
-                <w:sz w:val="18"/>
-                <w:szCs w:val="18"/>
-                <w:lang w:val="it-IT"/>
-              </w:rPr>
-              <w:t>admin</w:t>
-            </w:r>
-            <w:r>
-              <w:rPr>
-                <w:rFonts w:ascii="Times New Roman" w:hAnsi="Times New Roman"/>
-                <w:sz w:val="18"/>
-                <w:szCs w:val="18"/>
-                <w:lang w:val="it-IT"/>
-              </w:rPr>
-              <w:t xml:space="preserve">, si possa avere accesso alla </w:t>
-            </w:r>
-            <w:r>
-              <w:rPr>
-                <w:rFonts w:ascii="Times New Roman" w:hAnsi="Times New Roman"/>
-                <w:sz w:val="18"/>
-                <w:szCs w:val="18"/>
-                <w:lang w:val="it-IT"/>
-              </w:rPr>
-              <w:t>pagina</w:t>
-            </w:r>
-            <w:r>
-              <w:rPr>
-                <w:rFonts w:ascii="Times New Roman" w:hAnsi="Times New Roman"/>
-                <w:sz w:val="18"/>
-                <w:szCs w:val="18"/>
-                <w:lang w:val="it-IT"/>
-              </w:rPr>
-              <w:t xml:space="preserve"> di gestione </w:t>
-            </w:r>
-            <w:r>
-              <w:rPr>
-                <w:rFonts w:ascii="Times New Roman" w:hAnsi="Times New Roman"/>
-                <w:sz w:val="18"/>
-                <w:szCs w:val="18"/>
-                <w:lang w:val="it-IT"/>
-              </w:rPr>
-              <w:t>utenti</w:t>
-            </w:r>
-            <w:r>
-              <w:rPr>
-                <w:rFonts w:ascii="Times New Roman" w:hAnsi="Times New Roman"/>
-                <w:sz w:val="18"/>
-                <w:szCs w:val="18"/>
-                <w:lang w:val="it-IT"/>
-              </w:rPr>
-              <w:t>.</w:t>
+              <w:t>Verificare che avendo effettuato il login come admin, si possa avere accesso alla pagina di gestione utenti.</w:t>
             </w:r>
           </w:p>
         </w:tc>
@@ -8103,16 +8031,7 @@
                 <w:szCs w:val="18"/>
                 <w:lang w:val="en-GB" w:eastAsia="en-US"/>
               </w:rPr>
-              <w:t>del</w:t>
-            </w:r>
-            <w:r>
-              <w:rPr>
-                <w:rFonts w:ascii="Times New Roman" w:hAnsi="Times New Roman"/>
-                <w:sz w:val="18"/>
-                <w:szCs w:val="18"/>
-                <w:lang w:val="en-GB" w:eastAsia="en-US"/>
-              </w:rPr>
-              <w:t>l’admin</w:t>
+              <w:t>dell’admin</w:t>
             </w:r>
             <w:proofErr w:type="spellEnd"/>
           </w:p>
@@ -8297,70 +8216,7 @@
                 <w:szCs w:val="18"/>
                 <w:lang w:val="it-IT"/>
               </w:rPr>
-              <w:t xml:space="preserve">Una volta effettuato il login come </w:t>
-            </w:r>
-            <w:r>
-              <w:rPr>
-                <w:rFonts w:ascii="Times New Roman" w:hAnsi="Times New Roman"/>
-                <w:sz w:val="18"/>
-                <w:szCs w:val="18"/>
-                <w:lang w:val="it-IT"/>
-              </w:rPr>
-              <w:t>admin</w:t>
-            </w:r>
-            <w:r>
-              <w:rPr>
-                <w:rFonts w:ascii="Times New Roman" w:hAnsi="Times New Roman"/>
-                <w:sz w:val="18"/>
-                <w:szCs w:val="18"/>
-                <w:lang w:val="it-IT"/>
-              </w:rPr>
-              <w:t xml:space="preserve">, si deve </w:t>
-            </w:r>
-            <w:r>
-              <w:rPr>
-                <w:rFonts w:ascii="Times New Roman" w:hAnsi="Times New Roman"/>
-                <w:sz w:val="18"/>
-                <w:szCs w:val="18"/>
-                <w:lang w:val="it-IT"/>
-              </w:rPr>
-              <w:t>poter visualizzare</w:t>
-            </w:r>
-            <w:r>
-              <w:rPr>
-                <w:rFonts w:ascii="Times New Roman" w:hAnsi="Times New Roman"/>
-                <w:sz w:val="18"/>
-                <w:szCs w:val="18"/>
-                <w:lang w:val="it-IT"/>
-              </w:rPr>
-              <w:t xml:space="preserve"> </w:t>
-            </w:r>
-            <w:r>
-              <w:rPr>
-                <w:rFonts w:ascii="Times New Roman" w:hAnsi="Times New Roman"/>
-                <w:sz w:val="18"/>
-                <w:szCs w:val="18"/>
-                <w:lang w:val="it-IT"/>
-              </w:rPr>
-              <w:t>la</w:t>
-            </w:r>
-            <w:r>
-              <w:rPr>
-                <w:rFonts w:ascii="Times New Roman" w:hAnsi="Times New Roman"/>
-                <w:sz w:val="18"/>
-                <w:szCs w:val="18"/>
-                <w:lang w:val="it-IT"/>
-              </w:rPr>
-              <w:t xml:space="preserve"> pagina di gestione </w:t>
-            </w:r>
-            <w:r>
-              <w:rPr>
-                <w:rFonts w:ascii="Times New Roman" w:hAnsi="Times New Roman"/>
-                <w:sz w:val="18"/>
-                <w:szCs w:val="18"/>
-                <w:lang w:val="it-IT"/>
-              </w:rPr>
-              <w:t>utenti.</w:t>
+              <w:t>Una volta effettuato il login come admin, si deve poter visualizzare la pagina di gestione utenti.</w:t>
             </w:r>
           </w:p>
         </w:tc>
@@ -8508,6 +8364,14 @@
               </w:rPr>
               <w:t>REQ-</w:t>
             </w:r>
+            <w:r>
+              <w:rPr>
+                <w:rFonts w:ascii="Times New Roman" w:hAnsi="Times New Roman" w:cs="Times New Roman"/>
+                <w:sz w:val="18"/>
+                <w:szCs w:val="18"/>
+              </w:rPr>
+              <w:t>02</w:t>
+            </w:r>
           </w:p>
         </w:tc>
         <w:tc>
@@ -9479,7 +9343,27 @@
                 <w:szCs w:val="18"/>
                 <w:lang w:val="it-IT"/>
               </w:rPr>
-              <w:t xml:space="preserve">” dal menù a tendina </w:t>
+              <w:t xml:space="preserve">” dal </w:t>
+            </w:r>
+            <w:proofErr w:type="spellStart"/>
+            <w:r>
+              <w:rPr>
+                <w:rFonts w:ascii="Times New Roman" w:hAnsi="Times New Roman"/>
+                <w:sz w:val="18"/>
+                <w:szCs w:val="18"/>
+                <w:lang w:val="it-IT"/>
+              </w:rPr>
+              <w:t>menù</w:t>
+            </w:r>
+            <w:proofErr w:type="spellEnd"/>
+            <w:r>
+              <w:rPr>
+                <w:rFonts w:ascii="Times New Roman" w:hAnsi="Times New Roman"/>
+                <w:sz w:val="18"/>
+                <w:szCs w:val="18"/>
+                <w:lang w:val="it-IT"/>
+              </w:rPr>
+              <w:t xml:space="preserve"> a tendina </w:t>
             </w:r>
             <w:r>
               <w:rPr>
@@ -10039,17 +9923,7 @@
                 <w:szCs w:val="18"/>
                 <w:lang w:val="it-IT"/>
               </w:rPr>
-              <w:t>Frequent</w:t>
-            </w:r>
-            <w:bookmarkStart w:id="13" w:name="_GoBack"/>
-            <w:bookmarkEnd w:id="13"/>
-            <w:r>
-              <w:rPr>
-                <w:sz w:val="18"/>
-                <w:szCs w:val="18"/>
-                <w:lang w:val="it-IT"/>
-              </w:rPr>
-              <w:t>e</w:t>
+              <w:t>Frequente</w:t>
             </w:r>
           </w:p>
         </w:tc>
@@ -11864,14 +11738,27 @@
     <w:r>
       <w:t>/</w:t>
     </w:r>
-    <w:fldSimple w:instr=" NUMPAGES   \* MERGEFORMAT ">
-      <w:r>
-        <w:rPr>
-          <w:noProof/>
-        </w:rPr>
-        <w:t>2</w:t>
-      </w:r>
-    </w:fldSimple>
+    <w:r>
+      <w:fldChar w:fldCharType="begin"/>
+    </w:r>
+    <w:r>
+      <w:instrText xml:space="preserve"> NUMPAGES   \* MERGEFORMAT </w:instrText>
+    </w:r>
+    <w:r>
+      <w:fldChar w:fldCharType="separate"/>
+    </w:r>
+    <w:r>
+      <w:rPr>
+        <w:noProof/>
+      </w:rPr>
+      <w:t>2</w:t>
+    </w:r>
+    <w:r>
+      <w:rPr>
+        <w:noProof/>
+      </w:rPr>
+      <w:fldChar w:fldCharType="end"/>
+    </w:r>
   </w:p>
 </w:ftr>
 </file>
@@ -14228,7 +14115,7 @@
 </file>
 
 <file path=customXml/itemProps2.xml><?xml version="1.0" encoding="utf-8"?>
-<ds:datastoreItem xmlns:ds="http://schemas.openxmlformats.org/officeDocument/2006/customXml" ds:itemID="{9898F442-53C1-480B-BF60-369222E9BD88}">
+<ds:datastoreItem xmlns:ds="http://schemas.openxmlformats.org/officeDocument/2006/customXml" ds:itemID="{D26B37C7-AB13-42FC-920B-4AF0551EF627}">
   <ds:schemaRefs>
     <ds:schemaRef ds:uri="http://schemas.openxmlformats.org/officeDocument/2006/bibliography"/>
   </ds:schemaRefs>

</xml_diff>